<commit_message>
Update project proposal and programs page with revised budget, references, and additional content on ways to help
</commit_message>
<xml_diff>
--- a/documents/WEDE5020 Website Project Proposal 1.docx
+++ b/documents/WEDE5020 Website Project Proposal 1.docx
@@ -374,7 +374,7 @@
           <w:r>
             <w:fldChar w:fldCharType="separate"/>
           </w:r>
-          <w:hyperlink w:anchor="_Toc237638664" w:history="1">
+          <w:hyperlink w:anchor="_Toc237702209" w:history="1">
             <w:r>
               <w:rPr>
                 <w:rStyle w:val="Hyperlink"/>
@@ -401,7 +401,7 @@
                 <w:noProof/>
                 <w:webHidden/>
               </w:rPr>
-              <w:instrText xml:space="preserve"> PAGEREF _Toc237638664 \h </w:instrText>
+              <w:instrText xml:space="preserve"> PAGEREF _Toc237702209 \h </w:instrText>
             </w:r>
             <w:r>
               <w:rPr>
@@ -444,7 +444,7 @@
               <w:lang w:eastAsia="en-ZA"/>
             </w:rPr>
           </w:pPr>
-          <w:hyperlink w:anchor="_Toc237638665" w:history="1">
+          <w:hyperlink w:anchor="_Toc237702210" w:history="1">
             <w:r>
               <w:rPr>
                 <w:rStyle w:val="Hyperlink"/>
@@ -471,7 +471,7 @@
                 <w:noProof/>
                 <w:webHidden/>
               </w:rPr>
-              <w:instrText xml:space="preserve"> PAGEREF _Toc237638665 \h </w:instrText>
+              <w:instrText xml:space="preserve"> PAGEREF _Toc237702210 \h </w:instrText>
             </w:r>
             <w:r>
               <w:rPr>
@@ -514,7 +514,7 @@
               <w:lang w:eastAsia="en-ZA"/>
             </w:rPr>
           </w:pPr>
-          <w:hyperlink w:anchor="_Toc237638666" w:history="1">
+          <w:hyperlink w:anchor="_Toc237702211" w:history="1">
             <w:r>
               <w:rPr>
                 <w:rStyle w:val="Hyperlink"/>
@@ -541,7 +541,7 @@
                 <w:noProof/>
                 <w:webHidden/>
               </w:rPr>
-              <w:instrText xml:space="preserve"> PAGEREF _Toc237638666 \h </w:instrText>
+              <w:instrText xml:space="preserve"> PAGEREF _Toc237702211 \h </w:instrText>
             </w:r>
             <w:r>
               <w:rPr>
@@ -584,7 +584,7 @@
               <w:lang w:eastAsia="en-ZA"/>
             </w:rPr>
           </w:pPr>
-          <w:hyperlink w:anchor="_Toc237638667" w:history="1">
+          <w:hyperlink w:anchor="_Toc237702212" w:history="1">
             <w:r>
               <w:rPr>
                 <w:rStyle w:val="Hyperlink"/>
@@ -612,7 +612,7 @@
                 <w:noProof/>
                 <w:webHidden/>
               </w:rPr>
-              <w:instrText xml:space="preserve"> PAGEREF _Toc237638667 \h </w:instrText>
+              <w:instrText xml:space="preserve"> PAGEREF _Toc237702212 \h </w:instrText>
             </w:r>
             <w:r>
               <w:rPr>
@@ -655,7 +655,7 @@
               <w:lang w:eastAsia="en-ZA"/>
             </w:rPr>
           </w:pPr>
-          <w:hyperlink w:anchor="_Toc237638668" w:history="1">
+          <w:hyperlink w:anchor="_Toc237702213" w:history="1">
             <w:r>
               <w:rPr>
                 <w:rStyle w:val="Hyperlink"/>
@@ -683,7 +683,7 @@
                 <w:noProof/>
                 <w:webHidden/>
               </w:rPr>
-              <w:instrText xml:space="preserve"> PAGEREF _Toc237638668 \h </w:instrText>
+              <w:instrText xml:space="preserve"> PAGEREF _Toc237702213 \h </w:instrText>
             </w:r>
             <w:r>
               <w:rPr>
@@ -726,7 +726,7 @@
               <w:lang w:eastAsia="en-ZA"/>
             </w:rPr>
           </w:pPr>
-          <w:hyperlink w:anchor="_Toc237638669" w:history="1">
+          <w:hyperlink w:anchor="_Toc237702214" w:history="1">
             <w:r>
               <w:rPr>
                 <w:rStyle w:val="Hyperlink"/>
@@ -754,7 +754,7 @@
                 <w:noProof/>
                 <w:webHidden/>
               </w:rPr>
-              <w:instrText xml:space="preserve"> PAGEREF _Toc237638669 \h </w:instrText>
+              <w:instrText xml:space="preserve"> PAGEREF _Toc237702214 \h </w:instrText>
             </w:r>
             <w:r>
               <w:rPr>
@@ -797,7 +797,7 @@
               <w:lang w:eastAsia="en-ZA"/>
             </w:rPr>
           </w:pPr>
-          <w:hyperlink w:anchor="_Toc237638670" w:history="1">
+          <w:hyperlink w:anchor="_Toc237702215" w:history="1">
             <w:r>
               <w:rPr>
                 <w:rStyle w:val="Hyperlink"/>
@@ -825,7 +825,7 @@
                 <w:noProof/>
                 <w:webHidden/>
               </w:rPr>
-              <w:instrText xml:space="preserve"> PAGEREF _Toc237638670 \h </w:instrText>
+              <w:instrText xml:space="preserve"> PAGEREF _Toc237702215 \h </w:instrText>
             </w:r>
             <w:r>
               <w:rPr>
@@ -868,7 +868,7 @@
               <w:lang w:eastAsia="en-ZA"/>
             </w:rPr>
           </w:pPr>
-          <w:hyperlink w:anchor="_Toc237638671" w:history="1">
+          <w:hyperlink w:anchor="_Toc237702216" w:history="1">
             <w:r>
               <w:rPr>
                 <w:rStyle w:val="Hyperlink"/>
@@ -896,7 +896,7 @@
                 <w:noProof/>
                 <w:webHidden/>
               </w:rPr>
-              <w:instrText xml:space="preserve"> PAGEREF _Toc237638671 \h </w:instrText>
+              <w:instrText xml:space="preserve"> PAGEREF _Toc237702216 \h </w:instrText>
             </w:r>
             <w:r>
               <w:rPr>
@@ -916,7 +916,7 @@
                 <w:noProof/>
                 <w:webHidden/>
               </w:rPr>
-              <w:t>6</w:t>
+              <w:t>7</w:t>
             </w:r>
             <w:r>
               <w:rPr>
@@ -939,7 +939,7 @@
               <w:lang w:eastAsia="en-ZA"/>
             </w:rPr>
           </w:pPr>
-          <w:hyperlink w:anchor="_Toc237638672" w:history="1">
+          <w:hyperlink w:anchor="_Toc237702217" w:history="1">
             <w:r>
               <w:rPr>
                 <w:rStyle w:val="Hyperlink"/>
@@ -967,7 +967,7 @@
                 <w:noProof/>
                 <w:webHidden/>
               </w:rPr>
-              <w:instrText xml:space="preserve"> PAGEREF _Toc237638672 \h </w:instrText>
+              <w:instrText xml:space="preserve"> PAGEREF _Toc237702217 \h </w:instrText>
             </w:r>
             <w:r>
               <w:rPr>
@@ -987,7 +987,7 @@
                 <w:noProof/>
                 <w:webHidden/>
               </w:rPr>
-              <w:t>7</w:t>
+              <w:t>9</w:t>
             </w:r>
             <w:r>
               <w:rPr>
@@ -1072,7 +1072,7 @@
           <w:szCs w:val="24"/>
         </w:rPr>
       </w:pPr>
-      <w:bookmarkStart w:id="0" w:name="_Toc237638664"/>
+      <w:bookmarkStart w:id="0" w:name="_Toc237702209"/>
       <w:r>
         <w:rPr>
           <w:sz w:val="24"/>
@@ -1531,7 +1531,7 @@
           <w:szCs w:val="24"/>
         </w:rPr>
       </w:pPr>
-      <w:bookmarkStart w:id="1" w:name="_Toc237638665"/>
+      <w:bookmarkStart w:id="1" w:name="_Toc237702210"/>
       <w:r>
         <w:rPr>
           <w:sz w:val="24"/>
@@ -1988,7 +1988,7 @@
           <w:szCs w:val="24"/>
         </w:rPr>
       </w:pPr>
-      <w:bookmarkStart w:id="2" w:name="_Toc237638666"/>
+      <w:bookmarkStart w:id="2" w:name="_Toc237702211"/>
       <w:r>
         <w:rPr>
           <w:sz w:val="24"/>
@@ -2273,7 +2273,23 @@
           <w:szCs w:val="22"/>
           <w:lang w:val="en-US"/>
         </w:rPr>
-        <w:t>ity, lacking features such as</w:t>
+        <w:t>ity, lacking</w:t>
+      </w:r>
+      <w:r>
+        <w:rPr>
+          <w:sz w:val="22"/>
+          <w:szCs w:val="22"/>
+          <w:lang w:val="en-US"/>
+        </w:rPr>
+        <w:t xml:space="preserve"> easily accessible</w:t>
+      </w:r>
+      <w:r>
+        <w:rPr>
+          <w:sz w:val="22"/>
+          <w:szCs w:val="22"/>
+          <w:lang w:val="en-US"/>
+        </w:rPr>
+        <w:t xml:space="preserve"> features such as</w:t>
       </w:r>
       <w:r>
         <w:rPr>
@@ -2569,7 +2585,7 @@
           <w:lang w:val="en-US"/>
         </w:rPr>
       </w:pPr>
-      <w:bookmarkStart w:id="3" w:name="_Toc237638667"/>
+      <w:bookmarkStart w:id="3" w:name="_Toc237702212"/>
       <w:r>
         <w:rPr>
           <w:sz w:val="24"/>
@@ -2835,7 +2851,7 @@
           <w:lang w:val="en-US"/>
         </w:rPr>
       </w:pPr>
-      <w:bookmarkStart w:id="4" w:name="_Toc237638668"/>
+      <w:bookmarkStart w:id="4" w:name="_Toc237702213"/>
       <w:r>
         <w:rPr>
           <w:sz w:val="24"/>
@@ -3730,7 +3746,7 @@
           <w:lang w:val="en-US"/>
         </w:rPr>
       </w:pPr>
-      <w:bookmarkStart w:id="5" w:name="_Toc237638669"/>
+      <w:bookmarkStart w:id="5" w:name="_Toc237702214"/>
       <w:r>
         <w:rPr>
           <w:sz w:val="24"/>
@@ -3912,7 +3928,7 @@
           <w:lang w:val="en-US"/>
         </w:rPr>
       </w:pPr>
-      <w:bookmarkStart w:id="6" w:name="_Toc237638670"/>
+      <w:bookmarkStart w:id="6" w:name="_Toc237702215"/>
       <w:r>
         <w:rPr>
           <w:sz w:val="24"/>
@@ -4470,6 +4486,94 @@
     </w:p>
     <w:p>
       <w:pPr>
+        <w:rPr>
+          <w:b/>
+          <w:bCs/>
+          <w:sz w:val="22"/>
+          <w:szCs w:val="22"/>
+          <w:lang w:val="en-US"/>
+        </w:rPr>
+      </w:pPr>
+    </w:p>
+    <w:p>
+      <w:pPr>
+        <w:rPr>
+          <w:b/>
+          <w:bCs/>
+          <w:sz w:val="22"/>
+          <w:szCs w:val="22"/>
+          <w:lang w:val="en-US"/>
+        </w:rPr>
+      </w:pPr>
+    </w:p>
+    <w:p>
+      <w:pPr>
+        <w:rPr>
+          <w:b/>
+          <w:bCs/>
+          <w:sz w:val="22"/>
+          <w:szCs w:val="22"/>
+          <w:lang w:val="en-US"/>
+        </w:rPr>
+      </w:pPr>
+    </w:p>
+    <w:p>
+      <w:pPr>
+        <w:rPr>
+          <w:b/>
+          <w:bCs/>
+          <w:sz w:val="22"/>
+          <w:szCs w:val="22"/>
+          <w:lang w:val="en-US"/>
+        </w:rPr>
+      </w:pPr>
+    </w:p>
+    <w:p>
+      <w:pPr>
+        <w:rPr>
+          <w:b/>
+          <w:bCs/>
+          <w:sz w:val="22"/>
+          <w:szCs w:val="22"/>
+          <w:lang w:val="en-US"/>
+        </w:rPr>
+      </w:pPr>
+    </w:p>
+    <w:p>
+      <w:pPr>
+        <w:rPr>
+          <w:b/>
+          <w:bCs/>
+          <w:sz w:val="22"/>
+          <w:szCs w:val="22"/>
+          <w:lang w:val="en-US"/>
+        </w:rPr>
+      </w:pPr>
+    </w:p>
+    <w:p>
+      <w:pPr>
+        <w:rPr>
+          <w:b/>
+          <w:bCs/>
+          <w:sz w:val="22"/>
+          <w:szCs w:val="22"/>
+          <w:lang w:val="en-US"/>
+        </w:rPr>
+      </w:pPr>
+    </w:p>
+    <w:p>
+      <w:pPr>
+        <w:rPr>
+          <w:b/>
+          <w:bCs/>
+          <w:sz w:val="22"/>
+          <w:szCs w:val="22"/>
+          <w:lang w:val="en-US"/>
+        </w:rPr>
+      </w:pPr>
+    </w:p>
+    <w:p>
+      <w:pPr>
         <w:pStyle w:val="Heading1"/>
         <w:rPr>
           <w:sz w:val="24"/>
@@ -4477,13 +4581,14 @@
           <w:lang w:val="en-US"/>
         </w:rPr>
       </w:pPr>
-      <w:bookmarkStart w:id="7" w:name="_Toc237638671"/>
+      <w:bookmarkStart w:id="7" w:name="_Toc237702216"/>
       <w:r>
         <w:rPr>
           <w:sz w:val="24"/>
           <w:szCs w:val="24"/>
           <w:lang w:val="en-US"/>
         </w:rPr>
+        <w:lastRenderedPageBreak/>
         <w:t>Budget</w:t>
       </w:r>
       <w:bookmarkEnd w:id="7"/>
@@ -4521,33 +4626,426 @@
         <w:rPr>
           <w:sz w:val="22"/>
           <w:szCs w:val="22"/>
-          <w:lang w:val="en-US"/>
-        </w:rPr>
-      </w:pPr>
-      <w:r>
-        <w:rPr>
-          <w:sz w:val="22"/>
-          <w:szCs w:val="22"/>
-          <w:lang w:val="en-US"/>
-        </w:rPr>
-        <w:t>According to 2019 Annual Financial Report</w:t>
-      </w:r>
-    </w:p>
-    <w:p>
-      <w:pPr>
-        <w:rPr>
-          <w:sz w:val="22"/>
-          <w:szCs w:val="22"/>
-          <w:lang w:val="en-US"/>
-        </w:rPr>
-      </w:pPr>
-      <w:r>
-        <w:rPr>
-          <w:sz w:val="22"/>
-          <w:szCs w:val="22"/>
-          <w:lang w:val="en-US"/>
-        </w:rPr>
-        <w:t>Program Expenses</w:t>
+          <w:u w:val="single"/>
+          <w:lang w:val="en-US"/>
+        </w:rPr>
+      </w:pPr>
+      <w:r>
+        <w:rPr>
+          <w:sz w:val="22"/>
+          <w:szCs w:val="22"/>
+          <w:u w:val="single"/>
+          <w:lang w:val="en-US"/>
+        </w:rPr>
+        <w:t>According to 20</w:t>
+      </w:r>
+      <w:r>
+        <w:rPr>
+          <w:sz w:val="22"/>
+          <w:szCs w:val="22"/>
+          <w:u w:val="single"/>
+          <w:lang w:val="en-US"/>
+        </w:rPr>
+        <w:t>24</w:t>
+      </w:r>
+      <w:r>
+        <w:rPr>
+          <w:sz w:val="22"/>
+          <w:szCs w:val="22"/>
+          <w:u w:val="single"/>
+          <w:lang w:val="en-US"/>
+        </w:rPr>
+        <w:t xml:space="preserve"> Annual Financial Report</w:t>
+      </w:r>
+      <w:r>
+        <w:rPr>
+          <w:sz w:val="22"/>
+          <w:szCs w:val="22"/>
+          <w:u w:val="single"/>
+          <w:lang w:val="en-US"/>
+        </w:rPr>
+        <w:t xml:space="preserve"> and the 2025 Annual Financial Report</w:t>
+      </w:r>
+    </w:p>
+    <w:p>
+      <w:pPr>
+        <w:pStyle w:val="ListParagraph"/>
+        <w:numPr>
+          <w:ilvl w:val="0"/>
+          <w:numId w:val="11"/>
+        </w:numPr>
+        <w:rPr>
+          <w:sz w:val="22"/>
+          <w:szCs w:val="22"/>
+          <w:lang w:val="en-US"/>
+        </w:rPr>
+      </w:pPr>
+      <w:r>
+        <w:rPr>
+          <w:b/>
+          <w:bCs/>
+          <w:sz w:val="22"/>
+          <w:szCs w:val="22"/>
+          <w:lang w:val="en-US"/>
+        </w:rPr>
+        <w:t>Revenue</w:t>
+      </w:r>
+      <w:r>
+        <w:rPr>
+          <w:sz w:val="22"/>
+          <w:szCs w:val="22"/>
+          <w:lang w:val="en-US"/>
+        </w:rPr>
+        <w:t xml:space="preserve">: </w:t>
+      </w:r>
+    </w:p>
+    <w:p>
+      <w:pPr>
+        <w:pStyle w:val="ListParagraph"/>
+        <w:numPr>
+          <w:ilvl w:val="0"/>
+          <w:numId w:val="12"/>
+        </w:numPr>
+        <w:rPr>
+          <w:sz w:val="22"/>
+          <w:szCs w:val="22"/>
+          <w:lang w:val="en-US"/>
+        </w:rPr>
+      </w:pPr>
+      <w:r>
+        <w:rPr>
+          <w:sz w:val="22"/>
+          <w:szCs w:val="22"/>
+          <w:lang w:val="en-US"/>
+        </w:rPr>
+        <w:t>These include</w:t>
+      </w:r>
+      <w:r>
+        <w:rPr>
+          <w:sz w:val="22"/>
+          <w:szCs w:val="22"/>
+          <w:lang w:val="en-US"/>
+        </w:rPr>
+        <w:t>:</w:t>
+      </w:r>
+    </w:p>
+    <w:p>
+      <w:pPr>
+        <w:pStyle w:val="ListParagraph"/>
+        <w:ind w:left="1080"/>
+        <w:rPr>
+          <w:sz w:val="22"/>
+          <w:szCs w:val="22"/>
+          <w:lang w:val="en-US"/>
+        </w:rPr>
+      </w:pPr>
+      <w:r>
+        <w:rPr>
+          <w:sz w:val="22"/>
+          <w:szCs w:val="22"/>
+        </w:rPr>
+        <w:t>Grants: South Africa School Nutrition</w:t>
+      </w:r>
+    </w:p>
+    <w:p>
+      <w:pPr>
+        <w:pStyle w:val="ListParagraph"/>
+        <w:ind w:left="1080"/>
+        <w:rPr>
+          <w:sz w:val="22"/>
+          <w:szCs w:val="22"/>
+          <w:lang w:val="en-US"/>
+        </w:rPr>
+      </w:pPr>
+      <w:r>
+        <w:rPr>
+          <w:sz w:val="22"/>
+          <w:szCs w:val="22"/>
+        </w:rPr>
+        <w:t>Grants: Mozambique School Nutritio</w:t>
+      </w:r>
+      <w:r>
+        <w:rPr>
+          <w:sz w:val="22"/>
+          <w:szCs w:val="22"/>
+        </w:rPr>
+        <w:t>n</w:t>
+      </w:r>
+    </w:p>
+    <w:p>
+      <w:pPr>
+        <w:pStyle w:val="ListParagraph"/>
+        <w:ind w:left="1080"/>
+        <w:rPr>
+          <w:sz w:val="22"/>
+          <w:szCs w:val="22"/>
+          <w:lang w:val="en-US"/>
+        </w:rPr>
+      </w:pPr>
+      <w:r>
+        <w:rPr>
+          <w:sz w:val="22"/>
+          <w:szCs w:val="22"/>
+        </w:rPr>
+        <w:t>Grants: Malawi School Nutrition</w:t>
+      </w:r>
+    </w:p>
+    <w:p>
+      <w:pPr>
+        <w:pStyle w:val="ListParagraph"/>
+        <w:ind w:left="1080"/>
+        <w:rPr>
+          <w:sz w:val="22"/>
+          <w:szCs w:val="22"/>
+          <w:lang w:val="en-US"/>
+        </w:rPr>
+      </w:pPr>
+      <w:r>
+        <w:rPr>
+          <w:sz w:val="22"/>
+          <w:szCs w:val="22"/>
+          <w:lang w:val="en-US"/>
+        </w:rPr>
+        <w:t xml:space="preserve">Grants: </w:t>
+      </w:r>
+      <w:r>
+        <w:rPr>
+          <w:sz w:val="22"/>
+          <w:szCs w:val="22"/>
+          <w:lang w:val="en-US"/>
+        </w:rPr>
+        <w:t xml:space="preserve">Lesotho </w:t>
+      </w:r>
+      <w:r>
+        <w:rPr>
+          <w:sz w:val="22"/>
+          <w:szCs w:val="22"/>
+          <w:lang w:val="en-US"/>
+        </w:rPr>
+        <w:t>S</w:t>
+      </w:r>
+      <w:r>
+        <w:rPr>
+          <w:sz w:val="22"/>
+          <w:szCs w:val="22"/>
+          <w:lang w:val="en-US"/>
+        </w:rPr>
+        <w:t xml:space="preserve">chool </w:t>
+      </w:r>
+      <w:r>
+        <w:rPr>
+          <w:sz w:val="22"/>
+          <w:szCs w:val="22"/>
+          <w:lang w:val="en-US"/>
+        </w:rPr>
+        <w:t>N</w:t>
+      </w:r>
+      <w:r>
+        <w:rPr>
+          <w:sz w:val="22"/>
+          <w:szCs w:val="22"/>
+          <w:lang w:val="en-US"/>
+        </w:rPr>
+        <w:t>utrition</w:t>
+      </w:r>
+    </w:p>
+    <w:p>
+      <w:pPr>
+        <w:pStyle w:val="ListParagraph"/>
+        <w:ind w:left="1080"/>
+        <w:rPr>
+          <w:sz w:val="22"/>
+          <w:szCs w:val="22"/>
+          <w:lang w:val="en-US"/>
+        </w:rPr>
+      </w:pPr>
+      <w:r>
+        <w:rPr>
+          <w:sz w:val="22"/>
+          <w:szCs w:val="22"/>
+          <w:lang w:val="en-US"/>
+        </w:rPr>
+        <w:t xml:space="preserve">Grants: </w:t>
+      </w:r>
+      <w:r>
+        <w:rPr>
+          <w:sz w:val="22"/>
+          <w:szCs w:val="22"/>
+          <w:lang w:val="en-US"/>
+        </w:rPr>
+        <w:t xml:space="preserve">Relief </w:t>
+      </w:r>
+      <w:r>
+        <w:rPr>
+          <w:sz w:val="22"/>
+          <w:szCs w:val="22"/>
+          <w:lang w:val="en-US"/>
+        </w:rPr>
+        <w:t>F</w:t>
+      </w:r>
+      <w:r>
+        <w:rPr>
+          <w:sz w:val="22"/>
+          <w:szCs w:val="22"/>
+          <w:lang w:val="en-US"/>
+        </w:rPr>
+        <w:t>eeding</w:t>
+      </w:r>
+    </w:p>
+    <w:p>
+      <w:pPr>
+        <w:pStyle w:val="ListParagraph"/>
+        <w:ind w:left="1080"/>
+        <w:rPr>
+          <w:sz w:val="22"/>
+          <w:szCs w:val="22"/>
+          <w:lang w:val="en-US"/>
+        </w:rPr>
+      </w:pPr>
+      <w:r>
+        <w:rPr>
+          <w:sz w:val="22"/>
+          <w:szCs w:val="22"/>
+          <w:lang w:val="en-US"/>
+        </w:rPr>
+        <w:t xml:space="preserve">Grants: </w:t>
+      </w:r>
+      <w:r>
+        <w:rPr>
+          <w:sz w:val="22"/>
+          <w:szCs w:val="22"/>
+          <w:lang w:val="en-US"/>
+        </w:rPr>
+        <w:t>South Africa from</w:t>
+      </w:r>
+      <w:r>
+        <w:rPr>
+          <w:sz w:val="22"/>
+          <w:szCs w:val="22"/>
+          <w:lang w:val="en-US"/>
+        </w:rPr>
+        <w:t xml:space="preserve"> LBF USA</w:t>
+      </w:r>
+    </w:p>
+    <w:p>
+      <w:pPr>
+        <w:pStyle w:val="ListParagraph"/>
+        <w:ind w:left="1080"/>
+        <w:rPr>
+          <w:sz w:val="22"/>
+          <w:szCs w:val="22"/>
+          <w:lang w:val="en-US"/>
+        </w:rPr>
+      </w:pPr>
+      <w:r>
+        <w:rPr>
+          <w:sz w:val="22"/>
+          <w:szCs w:val="22"/>
+          <w:lang w:val="en-US"/>
+        </w:rPr>
+        <w:t xml:space="preserve">in </w:t>
+      </w:r>
+      <w:r>
+        <w:rPr>
+          <w:sz w:val="22"/>
+          <w:szCs w:val="22"/>
+          <w:lang w:val="en-US"/>
+        </w:rPr>
+        <w:t>K</w:t>
+      </w:r>
+      <w:r>
+        <w:rPr>
+          <w:sz w:val="22"/>
+          <w:szCs w:val="22"/>
+          <w:lang w:val="en-US"/>
+        </w:rPr>
+        <w:t xml:space="preserve">ind </w:t>
+      </w:r>
+      <w:r>
+        <w:rPr>
+          <w:sz w:val="22"/>
+          <w:szCs w:val="22"/>
+          <w:lang w:val="en-US"/>
+        </w:rPr>
+        <w:t>C</w:t>
+      </w:r>
+      <w:r>
+        <w:rPr>
+          <w:sz w:val="22"/>
+          <w:szCs w:val="22"/>
+          <w:lang w:val="en-US"/>
+        </w:rPr>
+        <w:t>ontributions</w:t>
+      </w:r>
+    </w:p>
+    <w:p>
+      <w:pPr>
+        <w:pStyle w:val="ListParagraph"/>
+        <w:ind w:left="1080"/>
+        <w:rPr>
+          <w:sz w:val="22"/>
+          <w:szCs w:val="22"/>
+          <w:lang w:val="en-US"/>
+        </w:rPr>
+      </w:pPr>
+      <w:r>
+        <w:rPr>
+          <w:sz w:val="22"/>
+          <w:szCs w:val="22"/>
+          <w:lang w:val="en-US"/>
+        </w:rPr>
+        <w:t>Smaller/Other D</w:t>
+      </w:r>
+      <w:r>
+        <w:rPr>
+          <w:sz w:val="22"/>
+          <w:szCs w:val="22"/>
+          <w:lang w:val="en-US"/>
+        </w:rPr>
+        <w:t>onations</w:t>
+      </w:r>
+    </w:p>
+    <w:p>
+      <w:pPr>
+        <w:pStyle w:val="ListParagraph"/>
+        <w:ind w:left="1080"/>
+        <w:rPr>
+          <w:sz w:val="22"/>
+          <w:szCs w:val="22"/>
+          <w:lang w:val="en-US"/>
+        </w:rPr>
+      </w:pPr>
+      <w:r>
+        <w:rPr>
+          <w:sz w:val="22"/>
+          <w:szCs w:val="22"/>
+          <w:lang w:val="en-US"/>
+        </w:rPr>
+        <w:t>I</w:t>
+      </w:r>
+      <w:r>
+        <w:rPr>
+          <w:sz w:val="22"/>
+          <w:szCs w:val="22"/>
+          <w:lang w:val="en-US"/>
+        </w:rPr>
+        <w:t xml:space="preserve">nvestment </w:t>
+      </w:r>
+      <w:r>
+        <w:rPr>
+          <w:sz w:val="22"/>
+          <w:szCs w:val="22"/>
+          <w:lang w:val="en-US"/>
+        </w:rPr>
+        <w:t>I</w:t>
+      </w:r>
+      <w:r>
+        <w:rPr>
+          <w:sz w:val="22"/>
+          <w:szCs w:val="22"/>
+          <w:lang w:val="en-US"/>
+        </w:rPr>
+        <w:t>ncome</w:t>
       </w:r>
       <w:r>
         <w:rPr>
@@ -4557,6 +5055,113 @@
         </w:rPr>
         <w:t xml:space="preserve"> </w:t>
       </w:r>
+    </w:p>
+    <w:p>
+      <w:pPr>
+        <w:pStyle w:val="ListParagraph"/>
+        <w:numPr>
+          <w:ilvl w:val="0"/>
+          <w:numId w:val="12"/>
+        </w:numPr>
+        <w:rPr>
+          <w:sz w:val="22"/>
+          <w:szCs w:val="22"/>
+          <w:lang w:val="en-US"/>
+        </w:rPr>
+      </w:pPr>
+      <w:r>
+        <w:rPr>
+          <w:sz w:val="22"/>
+          <w:szCs w:val="22"/>
+          <w:u w:val="single"/>
+          <w:lang w:val="en-US"/>
+        </w:rPr>
+        <w:t>T</w:t>
+      </w:r>
+      <w:r>
+        <w:rPr>
+          <w:sz w:val="22"/>
+          <w:szCs w:val="22"/>
+          <w:u w:val="single"/>
+          <w:lang w:val="en-US"/>
+        </w:rPr>
+        <w:t>OTAL</w:t>
+      </w:r>
+      <w:r>
+        <w:rPr>
+          <w:sz w:val="22"/>
+          <w:szCs w:val="22"/>
+          <w:u w:val="single"/>
+          <w:lang w:val="en-US"/>
+        </w:rPr>
+        <w:t xml:space="preserve"> R</w:t>
+      </w:r>
+      <w:r>
+        <w:rPr>
+          <w:sz w:val="22"/>
+          <w:szCs w:val="22"/>
+          <w:u w:val="single"/>
+          <w:lang w:val="en-US"/>
+        </w:rPr>
+        <w:t>EVENUE</w:t>
+      </w:r>
+      <w:r>
+        <w:rPr>
+          <w:sz w:val="22"/>
+          <w:szCs w:val="22"/>
+          <w:lang w:val="en-US"/>
+        </w:rPr>
+        <w:t>:</w:t>
+      </w:r>
+    </w:p>
+    <w:p>
+      <w:pPr>
+        <w:pStyle w:val="ListParagraph"/>
+        <w:ind w:left="1080"/>
+        <w:rPr>
+          <w:sz w:val="22"/>
+          <w:szCs w:val="22"/>
+          <w:lang w:val="en-US"/>
+        </w:rPr>
+      </w:pPr>
+      <w:r>
+        <w:rPr>
+          <w:sz w:val="22"/>
+          <w:szCs w:val="22"/>
+          <w:lang w:val="en-US"/>
+        </w:rPr>
+        <w:t xml:space="preserve">          </w:t>
+      </w:r>
+      <w:r>
+        <w:rPr>
+          <w:b/>
+          <w:bCs/>
+          <w:sz w:val="22"/>
+          <w:szCs w:val="22"/>
+          <w:u w:val="single"/>
+          <w:lang w:val="en-US"/>
+        </w:rPr>
+        <w:t>20</w:t>
+      </w:r>
+      <w:r>
+        <w:rPr>
+          <w:b/>
+          <w:bCs/>
+          <w:sz w:val="22"/>
+          <w:szCs w:val="22"/>
+          <w:u w:val="single"/>
+          <w:lang w:val="en-US"/>
+        </w:rPr>
+        <w:t>24</w:t>
+      </w:r>
+      <w:r>
+        <w:rPr>
+          <w:sz w:val="22"/>
+          <w:szCs w:val="22"/>
+          <w:lang w:val="en-US"/>
+        </w:rPr>
+        <w:t xml:space="preserve"> </w:t>
+      </w:r>
       <w:r>
         <w:rPr>
           <w:sz w:val="22"/>
@@ -4571,15 +5176,73 @@
           <w:szCs w:val="22"/>
           <w:lang w:val="en-US"/>
         </w:rPr>
-        <w:t xml:space="preserve"> R</w:t>
-      </w:r>
-      <w:r>
-        <w:rPr>
-          <w:sz w:val="22"/>
-          <w:szCs w:val="22"/>
-          <w:lang w:val="en-US"/>
-        </w:rPr>
-        <w:t>14</w:t>
+        <w:t xml:space="preserve"> </w:t>
+      </w:r>
+      <w:r>
+        <w:rPr>
+          <w:sz w:val="22"/>
+          <w:szCs w:val="22"/>
+          <w:lang w:val="en-US"/>
+        </w:rPr>
+        <w:t>R</w:t>
+      </w:r>
+      <w:r>
+        <w:rPr>
+          <w:sz w:val="22"/>
+          <w:szCs w:val="22"/>
+          <w:lang w:val="en-US"/>
+        </w:rPr>
+        <w:t>92 856 910</w:t>
+      </w:r>
+      <w:r>
+        <w:rPr>
+          <w:sz w:val="22"/>
+          <w:szCs w:val="22"/>
+          <w:lang w:val="en-US"/>
+        </w:rPr>
+        <w:t xml:space="preserve">                                                                         </w:t>
+      </w:r>
+      <w:r>
+        <w:rPr>
+          <w:b/>
+          <w:bCs/>
+          <w:sz w:val="22"/>
+          <w:szCs w:val="22"/>
+          <w:lang w:val="en-US"/>
+        </w:rPr>
+        <w:t>2025</w:t>
+      </w:r>
+      <w:r>
+        <w:rPr>
+          <w:sz w:val="22"/>
+          <w:szCs w:val="22"/>
+          <w:lang w:val="en-US"/>
+        </w:rPr>
+        <w:t xml:space="preserve"> </w:t>
+      </w:r>
+      <w:r>
+        <w:rPr>
+          <w:sz w:val="22"/>
+          <w:szCs w:val="22"/>
+          <w:lang w:val="en-US"/>
+        </w:rPr>
+        <w:t>–</w:t>
+      </w:r>
+      <w:r>
+        <w:rPr>
+          <w:sz w:val="22"/>
+          <w:szCs w:val="22"/>
+          <w:lang w:val="en-US"/>
+        </w:rPr>
+        <w:t xml:space="preserve"> </w:t>
+      </w:r>
+      <w:r>
+        <w:rPr>
+          <w:sz w:val="22"/>
+          <w:szCs w:val="22"/>
+          <w:lang w:val="en-US"/>
+        </w:rPr>
+        <w:t>R106 804</w:t>
       </w:r>
       <w:r>
         <w:rPr>
@@ -4595,40 +5258,1170 @@
           <w:szCs w:val="22"/>
           <w:lang w:val="en-US"/>
         </w:rPr>
-        <w:t>873</w:t>
-      </w:r>
-      <w:r>
-        <w:rPr>
-          <w:sz w:val="22"/>
-          <w:szCs w:val="22"/>
-          <w:lang w:val="en-US"/>
-        </w:rPr>
-        <w:t xml:space="preserve"> 217</w:t>
-      </w:r>
-    </w:p>
-    <w:p>
-      <w:pPr>
-        <w:rPr>
-          <w:sz w:val="22"/>
-          <w:szCs w:val="22"/>
-          <w:lang w:val="en-US"/>
-        </w:rPr>
-      </w:pPr>
-      <w:r>
-        <w:rPr>
-          <w:sz w:val="22"/>
-          <w:szCs w:val="22"/>
-          <w:lang w:val="en-US"/>
-        </w:rPr>
-        <w:t>Revenue</w:t>
-      </w:r>
-      <w:r>
-        <w:rPr>
-          <w:sz w:val="22"/>
-          <w:szCs w:val="22"/>
-          <w:lang w:val="en-US"/>
-        </w:rPr>
-        <w:t xml:space="preserve"> – R20 638</w:t>
+        <w:t>134</w:t>
+      </w:r>
+    </w:p>
+    <w:p>
+      <w:pPr>
+        <w:pStyle w:val="ListParagraph"/>
+        <w:ind w:left="1080"/>
+        <w:rPr>
+          <w:sz w:val="22"/>
+          <w:szCs w:val="22"/>
+          <w:lang w:val="en-US"/>
+        </w:rPr>
+      </w:pPr>
+    </w:p>
+    <w:p>
+      <w:pPr>
+        <w:pStyle w:val="ListParagraph"/>
+        <w:numPr>
+          <w:ilvl w:val="0"/>
+          <w:numId w:val="11"/>
+        </w:numPr>
+        <w:rPr>
+          <w:b/>
+          <w:bCs/>
+          <w:sz w:val="22"/>
+          <w:szCs w:val="22"/>
+          <w:lang w:val="en-US"/>
+        </w:rPr>
+      </w:pPr>
+      <w:r>
+        <w:rPr>
+          <w:b/>
+          <w:bCs/>
+          <w:sz w:val="22"/>
+          <w:szCs w:val="22"/>
+          <w:lang w:val="en-US"/>
+        </w:rPr>
+        <w:t xml:space="preserve">Program Expenses </w:t>
+      </w:r>
+    </w:p>
+    <w:p>
+      <w:pPr>
+        <w:pStyle w:val="ListParagraph"/>
+        <w:ind w:left="1080"/>
+        <w:rPr>
+          <w:sz w:val="22"/>
+          <w:szCs w:val="22"/>
+          <w:lang w:val="en-US"/>
+        </w:rPr>
+      </w:pPr>
+      <w:r>
+        <w:rPr>
+          <w:sz w:val="22"/>
+          <w:szCs w:val="22"/>
+          <w:lang w:val="en-US"/>
+        </w:rPr>
+        <w:t>These include:</w:t>
+      </w:r>
+    </w:p>
+    <w:p>
+      <w:pPr>
+        <w:pStyle w:val="ListParagraph"/>
+        <w:ind w:left="1080"/>
+        <w:rPr>
+          <w:b/>
+          <w:bCs/>
+          <w:sz w:val="22"/>
+          <w:szCs w:val="22"/>
+          <w:lang w:val="en-US"/>
+        </w:rPr>
+      </w:pPr>
+      <w:r>
+        <w:rPr>
+          <w:sz w:val="22"/>
+          <w:szCs w:val="22"/>
+          <w:lang w:val="en-US"/>
+        </w:rPr>
+        <w:t xml:space="preserve">South African </w:t>
+      </w:r>
+      <w:r>
+        <w:rPr>
+          <w:sz w:val="22"/>
+          <w:szCs w:val="22"/>
+          <w:lang w:val="en-US"/>
+        </w:rPr>
+        <w:t>N</w:t>
+      </w:r>
+      <w:r>
+        <w:rPr>
+          <w:sz w:val="22"/>
+          <w:szCs w:val="22"/>
+          <w:lang w:val="en-US"/>
+        </w:rPr>
+        <w:t xml:space="preserve">utrition </w:t>
+      </w:r>
+      <w:r>
+        <w:rPr>
+          <w:sz w:val="22"/>
+          <w:szCs w:val="22"/>
+          <w:lang w:val="en-US"/>
+        </w:rPr>
+        <w:t>P</w:t>
+      </w:r>
+      <w:r>
+        <w:rPr>
+          <w:sz w:val="22"/>
+          <w:szCs w:val="22"/>
+          <w:lang w:val="en-US"/>
+        </w:rPr>
+        <w:t xml:space="preserve">rogram </w:t>
+      </w:r>
+      <w:r>
+        <w:rPr>
+          <w:sz w:val="22"/>
+          <w:szCs w:val="22"/>
+          <w:lang w:val="en-US"/>
+        </w:rPr>
+        <w:t>F</w:t>
+      </w:r>
+      <w:r>
+        <w:rPr>
+          <w:sz w:val="22"/>
+          <w:szCs w:val="22"/>
+          <w:lang w:val="en-US"/>
+        </w:rPr>
+        <w:t>ood</w:t>
+      </w:r>
+      <w:r>
+        <w:rPr>
+          <w:sz w:val="22"/>
+          <w:szCs w:val="22"/>
+          <w:lang w:val="en-US"/>
+        </w:rPr>
+        <w:t>/</w:t>
+      </w:r>
+      <w:r>
+        <w:rPr>
+          <w:sz w:val="22"/>
+          <w:szCs w:val="22"/>
+          <w:lang w:val="en-US"/>
+        </w:rPr>
+        <w:t>T</w:t>
+      </w:r>
+      <w:r>
+        <w:rPr>
+          <w:sz w:val="22"/>
+          <w:szCs w:val="22"/>
+          <w:lang w:val="en-US"/>
+        </w:rPr>
+        <w:t>ransport</w:t>
+      </w:r>
+    </w:p>
+    <w:p>
+      <w:pPr>
+        <w:pStyle w:val="ListParagraph"/>
+        <w:ind w:left="1080"/>
+        <w:rPr>
+          <w:b/>
+          <w:bCs/>
+          <w:sz w:val="22"/>
+          <w:szCs w:val="22"/>
+          <w:lang w:val="en-US"/>
+        </w:rPr>
+      </w:pPr>
+      <w:r>
+        <w:rPr>
+          <w:sz w:val="22"/>
+          <w:szCs w:val="22"/>
+          <w:lang w:val="en-US"/>
+        </w:rPr>
+        <w:t xml:space="preserve">Mozambique </w:t>
+      </w:r>
+      <w:r>
+        <w:rPr>
+          <w:sz w:val="22"/>
+          <w:szCs w:val="22"/>
+          <w:lang w:val="en-US"/>
+        </w:rPr>
+        <w:t>N</w:t>
+      </w:r>
+      <w:r>
+        <w:rPr>
+          <w:sz w:val="22"/>
+          <w:szCs w:val="22"/>
+          <w:lang w:val="en-US"/>
+        </w:rPr>
+        <w:t xml:space="preserve">utrition </w:t>
+      </w:r>
+      <w:r>
+        <w:rPr>
+          <w:sz w:val="22"/>
+          <w:szCs w:val="22"/>
+          <w:lang w:val="en-US"/>
+        </w:rPr>
+        <w:t>P</w:t>
+      </w:r>
+      <w:r>
+        <w:rPr>
+          <w:sz w:val="22"/>
+          <w:szCs w:val="22"/>
+          <w:lang w:val="en-US"/>
+        </w:rPr>
+        <w:t xml:space="preserve">rogram </w:t>
+      </w:r>
+      <w:r>
+        <w:rPr>
+          <w:sz w:val="22"/>
+          <w:szCs w:val="22"/>
+          <w:lang w:val="en-US"/>
+        </w:rPr>
+        <w:t>T</w:t>
+      </w:r>
+      <w:r>
+        <w:rPr>
+          <w:sz w:val="22"/>
+          <w:szCs w:val="22"/>
+          <w:lang w:val="en-US"/>
+        </w:rPr>
+        <w:t>ood</w:t>
+      </w:r>
+      <w:r>
+        <w:rPr>
+          <w:sz w:val="22"/>
+          <w:szCs w:val="22"/>
+          <w:lang w:val="en-US"/>
+        </w:rPr>
+        <w:t>/</w:t>
+      </w:r>
+      <w:r>
+        <w:rPr>
+          <w:sz w:val="22"/>
+          <w:szCs w:val="22"/>
+          <w:lang w:val="en-US"/>
+        </w:rPr>
+        <w:t>T</w:t>
+      </w:r>
+      <w:r>
+        <w:rPr>
+          <w:sz w:val="22"/>
+          <w:szCs w:val="22"/>
+          <w:lang w:val="en-US"/>
+        </w:rPr>
+        <w:t>ransport</w:t>
+      </w:r>
+    </w:p>
+    <w:p>
+      <w:pPr>
+        <w:pStyle w:val="ListParagraph"/>
+        <w:ind w:left="1080"/>
+        <w:rPr>
+          <w:b/>
+          <w:bCs/>
+          <w:sz w:val="22"/>
+          <w:szCs w:val="22"/>
+          <w:lang w:val="en-US"/>
+        </w:rPr>
+      </w:pPr>
+      <w:r>
+        <w:rPr>
+          <w:sz w:val="22"/>
+          <w:szCs w:val="22"/>
+          <w:lang w:val="en-US"/>
+        </w:rPr>
+        <w:t xml:space="preserve">Malawi </w:t>
+      </w:r>
+      <w:r>
+        <w:rPr>
+          <w:sz w:val="22"/>
+          <w:szCs w:val="22"/>
+          <w:lang w:val="en-US"/>
+        </w:rPr>
+        <w:t>N</w:t>
+      </w:r>
+      <w:r>
+        <w:rPr>
+          <w:sz w:val="22"/>
+          <w:szCs w:val="22"/>
+          <w:lang w:val="en-US"/>
+        </w:rPr>
+        <w:t xml:space="preserve">utrition </w:t>
+      </w:r>
+      <w:r>
+        <w:rPr>
+          <w:sz w:val="22"/>
+          <w:szCs w:val="22"/>
+          <w:lang w:val="en-US"/>
+        </w:rPr>
+        <w:t>P</w:t>
+      </w:r>
+      <w:r>
+        <w:rPr>
+          <w:sz w:val="22"/>
+          <w:szCs w:val="22"/>
+          <w:lang w:val="en-US"/>
+        </w:rPr>
+        <w:t xml:space="preserve">rogram </w:t>
+      </w:r>
+      <w:r>
+        <w:rPr>
+          <w:sz w:val="22"/>
+          <w:szCs w:val="22"/>
+          <w:lang w:val="en-US"/>
+        </w:rPr>
+        <w:t>F</w:t>
+      </w:r>
+      <w:r>
+        <w:rPr>
+          <w:sz w:val="22"/>
+          <w:szCs w:val="22"/>
+          <w:lang w:val="en-US"/>
+        </w:rPr>
+        <w:t>ood/</w:t>
+      </w:r>
+      <w:r>
+        <w:rPr>
+          <w:sz w:val="22"/>
+          <w:szCs w:val="22"/>
+          <w:lang w:val="en-US"/>
+        </w:rPr>
+        <w:t>T</w:t>
+      </w:r>
+      <w:r>
+        <w:rPr>
+          <w:sz w:val="22"/>
+          <w:szCs w:val="22"/>
+          <w:lang w:val="en-US"/>
+        </w:rPr>
+        <w:t>ransport</w:t>
+      </w:r>
+    </w:p>
+    <w:p>
+      <w:pPr>
+        <w:pStyle w:val="ListParagraph"/>
+        <w:ind w:left="1080"/>
+        <w:rPr>
+          <w:b/>
+          <w:bCs/>
+          <w:sz w:val="22"/>
+          <w:szCs w:val="22"/>
+          <w:lang w:val="en-US"/>
+        </w:rPr>
+      </w:pPr>
+      <w:r>
+        <w:rPr>
+          <w:sz w:val="22"/>
+          <w:szCs w:val="22"/>
+          <w:lang w:val="en-US"/>
+        </w:rPr>
+        <w:t xml:space="preserve">Lesotho </w:t>
+      </w:r>
+      <w:r>
+        <w:rPr>
+          <w:sz w:val="22"/>
+          <w:szCs w:val="22"/>
+          <w:lang w:val="en-US"/>
+        </w:rPr>
+        <w:t>N</w:t>
+      </w:r>
+      <w:r>
+        <w:rPr>
+          <w:sz w:val="22"/>
+          <w:szCs w:val="22"/>
+          <w:lang w:val="en-US"/>
+        </w:rPr>
+        <w:t xml:space="preserve">utrition </w:t>
+      </w:r>
+      <w:r>
+        <w:rPr>
+          <w:sz w:val="22"/>
+          <w:szCs w:val="22"/>
+          <w:lang w:val="en-US"/>
+        </w:rPr>
+        <w:t>P</w:t>
+      </w:r>
+      <w:r>
+        <w:rPr>
+          <w:sz w:val="22"/>
+          <w:szCs w:val="22"/>
+          <w:lang w:val="en-US"/>
+        </w:rPr>
+        <w:t xml:space="preserve">rogram </w:t>
+      </w:r>
+      <w:r>
+        <w:rPr>
+          <w:sz w:val="22"/>
+          <w:szCs w:val="22"/>
+          <w:lang w:val="en-US"/>
+        </w:rPr>
+        <w:t>F</w:t>
+      </w:r>
+      <w:r>
+        <w:rPr>
+          <w:sz w:val="22"/>
+          <w:szCs w:val="22"/>
+          <w:lang w:val="en-US"/>
+        </w:rPr>
+        <w:t>ood</w:t>
+      </w:r>
+      <w:r>
+        <w:rPr>
+          <w:sz w:val="22"/>
+          <w:szCs w:val="22"/>
+          <w:lang w:val="en-US"/>
+        </w:rPr>
+        <w:t>/</w:t>
+      </w:r>
+      <w:r>
+        <w:rPr>
+          <w:sz w:val="22"/>
+          <w:szCs w:val="22"/>
+          <w:lang w:val="en-US"/>
+        </w:rPr>
+        <w:t>T</w:t>
+      </w:r>
+      <w:r>
+        <w:rPr>
+          <w:sz w:val="22"/>
+          <w:szCs w:val="22"/>
+          <w:lang w:val="en-US"/>
+        </w:rPr>
+        <w:t>ransport</w:t>
+      </w:r>
+    </w:p>
+    <w:p>
+      <w:pPr>
+        <w:pStyle w:val="ListParagraph"/>
+        <w:ind w:left="1080"/>
+        <w:rPr>
+          <w:b/>
+          <w:bCs/>
+          <w:sz w:val="22"/>
+          <w:szCs w:val="22"/>
+          <w:lang w:val="en-US"/>
+        </w:rPr>
+      </w:pPr>
+      <w:r>
+        <w:rPr>
+          <w:sz w:val="22"/>
+          <w:szCs w:val="22"/>
+          <w:lang w:val="en-US"/>
+        </w:rPr>
+        <w:t>M</w:t>
+      </w:r>
+      <w:r>
+        <w:rPr>
+          <w:sz w:val="22"/>
+          <w:szCs w:val="22"/>
+          <w:lang w:val="en-US"/>
+        </w:rPr>
+        <w:t xml:space="preserve">onitoring and </w:t>
+      </w:r>
+      <w:r>
+        <w:rPr>
+          <w:sz w:val="22"/>
+          <w:szCs w:val="22"/>
+          <w:lang w:val="en-US"/>
+        </w:rPr>
+        <w:t>E</w:t>
+      </w:r>
+      <w:r>
+        <w:rPr>
+          <w:sz w:val="22"/>
+          <w:szCs w:val="22"/>
+          <w:lang w:val="en-US"/>
+        </w:rPr>
+        <w:t>valuation</w:t>
+      </w:r>
+    </w:p>
+    <w:p>
+      <w:pPr>
+        <w:pStyle w:val="ListParagraph"/>
+        <w:ind w:left="1080"/>
+        <w:rPr>
+          <w:b/>
+          <w:bCs/>
+          <w:sz w:val="22"/>
+          <w:szCs w:val="22"/>
+          <w:lang w:val="en-US"/>
+        </w:rPr>
+      </w:pPr>
+      <w:r>
+        <w:rPr>
+          <w:sz w:val="22"/>
+          <w:szCs w:val="22"/>
+          <w:lang w:val="en-US"/>
+        </w:rPr>
+        <w:t>R</w:t>
+      </w:r>
+      <w:r>
+        <w:rPr>
+          <w:sz w:val="22"/>
+          <w:szCs w:val="22"/>
+          <w:lang w:val="en-US"/>
+        </w:rPr>
+        <w:t xml:space="preserve">elief </w:t>
+      </w:r>
+      <w:r>
+        <w:rPr>
+          <w:sz w:val="22"/>
+          <w:szCs w:val="22"/>
+          <w:lang w:val="en-US"/>
+        </w:rPr>
+        <w:t>F</w:t>
+      </w:r>
+      <w:r>
+        <w:rPr>
+          <w:sz w:val="22"/>
+          <w:szCs w:val="22"/>
+          <w:lang w:val="en-US"/>
+        </w:rPr>
+        <w:t xml:space="preserve">eeding </w:t>
+      </w:r>
+      <w:r>
+        <w:rPr>
+          <w:sz w:val="22"/>
+          <w:szCs w:val="22"/>
+          <w:lang w:val="en-US"/>
+        </w:rPr>
+        <w:t>P</w:t>
+      </w:r>
+      <w:r>
+        <w:rPr>
+          <w:sz w:val="22"/>
+          <w:szCs w:val="22"/>
+          <w:lang w:val="en-US"/>
+        </w:rPr>
+        <w:t xml:space="preserve">rogram </w:t>
+      </w:r>
+      <w:r>
+        <w:rPr>
+          <w:sz w:val="22"/>
+          <w:szCs w:val="22"/>
+          <w:lang w:val="en-US"/>
+        </w:rPr>
+        <w:t>F</w:t>
+      </w:r>
+      <w:r>
+        <w:rPr>
+          <w:sz w:val="22"/>
+          <w:szCs w:val="22"/>
+          <w:lang w:val="en-US"/>
+        </w:rPr>
+        <w:t>ood</w:t>
+      </w:r>
+      <w:r>
+        <w:rPr>
+          <w:sz w:val="22"/>
+          <w:szCs w:val="22"/>
+          <w:lang w:val="en-US"/>
+        </w:rPr>
+        <w:t>/</w:t>
+      </w:r>
+      <w:r>
+        <w:rPr>
+          <w:sz w:val="22"/>
+          <w:szCs w:val="22"/>
+          <w:lang w:val="en-US"/>
+        </w:rPr>
+        <w:t>T</w:t>
+      </w:r>
+      <w:r>
+        <w:rPr>
+          <w:sz w:val="22"/>
+          <w:szCs w:val="22"/>
+          <w:lang w:val="en-US"/>
+        </w:rPr>
+        <w:t>ransport</w:t>
+      </w:r>
+    </w:p>
+    <w:p>
+      <w:pPr>
+        <w:pStyle w:val="ListParagraph"/>
+        <w:ind w:left="1080"/>
+        <w:rPr>
+          <w:b/>
+          <w:bCs/>
+          <w:sz w:val="22"/>
+          <w:szCs w:val="22"/>
+          <w:lang w:val="en-US"/>
+        </w:rPr>
+      </w:pPr>
+      <w:r>
+        <w:rPr>
+          <w:sz w:val="22"/>
+          <w:szCs w:val="22"/>
+          <w:lang w:val="en-US"/>
+        </w:rPr>
+        <w:t>V</w:t>
+      </w:r>
+      <w:r>
+        <w:rPr>
+          <w:sz w:val="22"/>
+          <w:szCs w:val="22"/>
+          <w:lang w:val="en-US"/>
+        </w:rPr>
+        <w:t xml:space="preserve">olunteer </w:t>
+      </w:r>
+      <w:r>
+        <w:rPr>
+          <w:sz w:val="22"/>
+          <w:szCs w:val="22"/>
+          <w:lang w:val="en-US"/>
+        </w:rPr>
+        <w:t>S</w:t>
+      </w:r>
+      <w:r>
+        <w:rPr>
+          <w:sz w:val="22"/>
+          <w:szCs w:val="22"/>
+          <w:lang w:val="en-US"/>
+        </w:rPr>
+        <w:t>t</w:t>
+      </w:r>
+      <w:r>
+        <w:rPr>
+          <w:sz w:val="22"/>
+          <w:szCs w:val="22"/>
+          <w:lang w:val="en-US"/>
+        </w:rPr>
+        <w:t xml:space="preserve">ipends </w:t>
+      </w:r>
+      <w:r>
+        <w:rPr>
+          <w:sz w:val="22"/>
+          <w:szCs w:val="22"/>
+          <w:lang w:val="en-US"/>
+        </w:rPr>
+        <w:t>F</w:t>
+      </w:r>
+      <w:r>
+        <w:rPr>
+          <w:sz w:val="22"/>
+          <w:szCs w:val="22"/>
+          <w:lang w:val="en-US"/>
+        </w:rPr>
+        <w:t xml:space="preserve">ood </w:t>
+      </w:r>
+      <w:r>
+        <w:rPr>
+          <w:sz w:val="22"/>
+          <w:szCs w:val="22"/>
+          <w:lang w:val="en-US"/>
+        </w:rPr>
+        <w:t>M</w:t>
+      </w:r>
+      <w:r>
+        <w:rPr>
+          <w:sz w:val="22"/>
+          <w:szCs w:val="22"/>
+          <w:lang w:val="en-US"/>
+        </w:rPr>
+        <w:t>amas</w:t>
+      </w:r>
+    </w:p>
+    <w:p>
+      <w:pPr>
+        <w:pStyle w:val="ListParagraph"/>
+        <w:ind w:left="1080"/>
+        <w:rPr>
+          <w:b/>
+          <w:bCs/>
+          <w:sz w:val="22"/>
+          <w:szCs w:val="22"/>
+          <w:lang w:val="en-US"/>
+        </w:rPr>
+      </w:pPr>
+      <w:proofErr w:type="gramStart"/>
+      <w:r>
+        <w:rPr>
+          <w:sz w:val="22"/>
+          <w:szCs w:val="22"/>
+          <w:lang w:val="en-US"/>
+        </w:rPr>
+        <w:t>P</w:t>
+      </w:r>
+      <w:r>
+        <w:rPr>
+          <w:sz w:val="22"/>
+          <w:szCs w:val="22"/>
+          <w:lang w:val="en-US"/>
+        </w:rPr>
+        <w:t>rogram</w:t>
+      </w:r>
+      <w:proofErr w:type="gramEnd"/>
+      <w:r>
+        <w:rPr>
+          <w:sz w:val="22"/>
+          <w:szCs w:val="22"/>
+          <w:lang w:val="en-US"/>
+        </w:rPr>
+        <w:t xml:space="preserve"> </w:t>
+      </w:r>
+      <w:r>
+        <w:rPr>
+          <w:sz w:val="22"/>
+          <w:szCs w:val="22"/>
+          <w:lang w:val="en-US"/>
+        </w:rPr>
+        <w:t>M</w:t>
+      </w:r>
+      <w:r>
+        <w:rPr>
+          <w:sz w:val="22"/>
+          <w:szCs w:val="22"/>
+          <w:lang w:val="en-US"/>
+        </w:rPr>
+        <w:t>aterials</w:t>
+      </w:r>
+      <w:r>
+        <w:rPr>
+          <w:sz w:val="22"/>
+          <w:szCs w:val="22"/>
+          <w:lang w:val="en-US"/>
+        </w:rPr>
+        <w:t>/</w:t>
+      </w:r>
+      <w:r>
+        <w:rPr>
+          <w:sz w:val="22"/>
+          <w:szCs w:val="22"/>
+          <w:lang w:val="en-US"/>
+        </w:rPr>
+        <w:t>D</w:t>
+      </w:r>
+      <w:r>
+        <w:rPr>
+          <w:sz w:val="22"/>
+          <w:szCs w:val="22"/>
+          <w:lang w:val="en-US"/>
+        </w:rPr>
+        <w:t xml:space="preserve">esign </w:t>
+      </w:r>
+      <w:r>
+        <w:rPr>
+          <w:sz w:val="22"/>
+          <w:szCs w:val="22"/>
+          <w:lang w:val="en-US"/>
+        </w:rPr>
+        <w:t>F</w:t>
+      </w:r>
+      <w:r>
+        <w:rPr>
+          <w:sz w:val="22"/>
+          <w:szCs w:val="22"/>
+          <w:lang w:val="en-US"/>
+        </w:rPr>
+        <w:t>ees</w:t>
+      </w:r>
+    </w:p>
+    <w:p>
+      <w:pPr>
+        <w:pStyle w:val="ListParagraph"/>
+        <w:ind w:left="1080"/>
+        <w:rPr>
+          <w:b/>
+          <w:bCs/>
+          <w:sz w:val="22"/>
+          <w:szCs w:val="22"/>
+          <w:lang w:val="en-US"/>
+        </w:rPr>
+      </w:pPr>
+      <w:r>
+        <w:rPr>
+          <w:sz w:val="22"/>
+          <w:szCs w:val="22"/>
+          <w:lang w:val="en-US"/>
+        </w:rPr>
+        <w:t>R</w:t>
+      </w:r>
+      <w:r>
+        <w:rPr>
+          <w:sz w:val="22"/>
+          <w:szCs w:val="22"/>
+          <w:lang w:val="en-US"/>
+        </w:rPr>
+        <w:t>esearch</w:t>
+      </w:r>
+      <w:r>
+        <w:rPr>
+          <w:sz w:val="22"/>
+          <w:szCs w:val="22"/>
+          <w:lang w:val="en-US"/>
+        </w:rPr>
+        <w:t>/</w:t>
+      </w:r>
+      <w:r>
+        <w:rPr>
+          <w:sz w:val="22"/>
+          <w:szCs w:val="22"/>
+          <w:lang w:val="en-US"/>
+        </w:rPr>
+        <w:t>N</w:t>
+      </w:r>
+      <w:r>
+        <w:rPr>
+          <w:sz w:val="22"/>
+          <w:szCs w:val="22"/>
+          <w:lang w:val="en-US"/>
+        </w:rPr>
+        <w:t xml:space="preserve">utrition </w:t>
+      </w:r>
+      <w:r>
+        <w:rPr>
+          <w:sz w:val="22"/>
+          <w:szCs w:val="22"/>
+          <w:lang w:val="en-US"/>
+        </w:rPr>
+        <w:t>E</w:t>
+      </w:r>
+      <w:r>
+        <w:rPr>
+          <w:sz w:val="22"/>
+          <w:szCs w:val="22"/>
+          <w:lang w:val="en-US"/>
+        </w:rPr>
+        <w:t>valuation</w:t>
+      </w:r>
+    </w:p>
+    <w:p>
+      <w:pPr>
+        <w:pStyle w:val="ListParagraph"/>
+        <w:ind w:left="1080"/>
+        <w:rPr>
+          <w:b/>
+          <w:bCs/>
+          <w:sz w:val="22"/>
+          <w:szCs w:val="22"/>
+          <w:lang w:val="en-US"/>
+        </w:rPr>
+      </w:pPr>
+      <w:r>
+        <w:rPr>
+          <w:sz w:val="22"/>
+          <w:szCs w:val="22"/>
+          <w:lang w:val="en-US"/>
+        </w:rPr>
+        <w:t xml:space="preserve">LBF USA </w:t>
+      </w:r>
+      <w:proofErr w:type="gramStart"/>
+      <w:r>
+        <w:rPr>
+          <w:sz w:val="22"/>
+          <w:szCs w:val="22"/>
+          <w:lang w:val="en-US"/>
+        </w:rPr>
+        <w:t>F</w:t>
+      </w:r>
+      <w:r>
+        <w:rPr>
+          <w:sz w:val="22"/>
+          <w:szCs w:val="22"/>
+          <w:lang w:val="en-US"/>
+        </w:rPr>
+        <w:t>unding to</w:t>
+      </w:r>
+      <w:proofErr w:type="gramEnd"/>
+      <w:r>
+        <w:rPr>
+          <w:sz w:val="22"/>
+          <w:szCs w:val="22"/>
+          <w:lang w:val="en-US"/>
+        </w:rPr>
+        <w:t xml:space="preserve"> LBF</w:t>
+      </w:r>
+      <w:r>
+        <w:rPr>
+          <w:sz w:val="22"/>
+          <w:szCs w:val="22"/>
+          <w:lang w:val="en-US"/>
+        </w:rPr>
+        <w:t xml:space="preserve"> </w:t>
+      </w:r>
+      <w:r>
+        <w:rPr>
+          <w:sz w:val="22"/>
+          <w:szCs w:val="22"/>
+          <w:lang w:val="en-US"/>
+        </w:rPr>
+        <w:t>SA</w:t>
+      </w:r>
+    </w:p>
+    <w:p>
+      <w:pPr>
+        <w:pStyle w:val="ListParagraph"/>
+        <w:ind w:left="1080"/>
+        <w:rPr>
+          <w:b/>
+          <w:bCs/>
+          <w:sz w:val="22"/>
+          <w:szCs w:val="22"/>
+          <w:lang w:val="en-US"/>
+        </w:rPr>
+      </w:pPr>
+      <w:r>
+        <w:rPr>
+          <w:sz w:val="22"/>
+          <w:szCs w:val="22"/>
+          <w:lang w:val="en-US"/>
+        </w:rPr>
+        <w:t>S</w:t>
+      </w:r>
+      <w:r>
+        <w:rPr>
+          <w:sz w:val="22"/>
+          <w:szCs w:val="22"/>
+          <w:lang w:val="en-US"/>
+        </w:rPr>
+        <w:t xml:space="preserve">taff </w:t>
+      </w:r>
+      <w:r>
+        <w:rPr>
+          <w:sz w:val="22"/>
+          <w:szCs w:val="22"/>
+          <w:lang w:val="en-US"/>
+        </w:rPr>
+        <w:t>T</w:t>
+      </w:r>
+      <w:r>
+        <w:rPr>
+          <w:sz w:val="22"/>
+          <w:szCs w:val="22"/>
+          <w:lang w:val="en-US"/>
+        </w:rPr>
+        <w:t>raining</w:t>
+      </w:r>
+    </w:p>
+    <w:p>
+      <w:pPr>
+        <w:pStyle w:val="ListParagraph"/>
+        <w:numPr>
+          <w:ilvl w:val="0"/>
+          <w:numId w:val="12"/>
+        </w:numPr>
+        <w:rPr>
+          <w:sz w:val="22"/>
+          <w:szCs w:val="22"/>
+          <w:u w:val="single"/>
+          <w:lang w:val="en-US"/>
+        </w:rPr>
+      </w:pPr>
+      <w:r>
+        <w:rPr>
+          <w:sz w:val="22"/>
+          <w:szCs w:val="22"/>
+          <w:u w:val="single"/>
+          <w:lang w:val="en-US"/>
+        </w:rPr>
+        <w:t>T</w:t>
+      </w:r>
+      <w:r>
+        <w:rPr>
+          <w:sz w:val="22"/>
+          <w:szCs w:val="22"/>
+          <w:u w:val="single"/>
+          <w:lang w:val="en-US"/>
+        </w:rPr>
+        <w:t>o</w:t>
+      </w:r>
+      <w:r>
+        <w:rPr>
+          <w:sz w:val="22"/>
+          <w:szCs w:val="22"/>
+          <w:u w:val="single"/>
+          <w:lang w:val="en-US"/>
+        </w:rPr>
+        <w:t>OTAL</w:t>
+      </w:r>
+      <w:r>
+        <w:rPr>
+          <w:sz w:val="22"/>
+          <w:szCs w:val="22"/>
+          <w:u w:val="single"/>
+          <w:lang w:val="en-US"/>
+        </w:rPr>
+        <w:t xml:space="preserve"> </w:t>
+      </w:r>
+      <w:r>
+        <w:rPr>
+          <w:sz w:val="22"/>
+          <w:szCs w:val="22"/>
+          <w:u w:val="single"/>
+          <w:lang w:val="en-US"/>
+        </w:rPr>
+        <w:t>P</w:t>
+      </w:r>
+      <w:r>
+        <w:rPr>
+          <w:sz w:val="22"/>
+          <w:szCs w:val="22"/>
+          <w:u w:val="single"/>
+          <w:lang w:val="en-US"/>
+        </w:rPr>
+        <w:t>ROGRAM</w:t>
+      </w:r>
+      <w:r>
+        <w:rPr>
+          <w:sz w:val="22"/>
+          <w:szCs w:val="22"/>
+          <w:u w:val="single"/>
+          <w:lang w:val="en-US"/>
+        </w:rPr>
+        <w:t xml:space="preserve"> </w:t>
+      </w:r>
+      <w:r>
+        <w:rPr>
+          <w:sz w:val="22"/>
+          <w:szCs w:val="22"/>
+          <w:u w:val="single"/>
+          <w:lang w:val="en-US"/>
+        </w:rPr>
+        <w:t>E</w:t>
+      </w:r>
+      <w:r>
+        <w:rPr>
+          <w:sz w:val="22"/>
+          <w:szCs w:val="22"/>
+          <w:u w:val="single"/>
+          <w:lang w:val="en-US"/>
+        </w:rPr>
+        <w:t>XPENSES</w:t>
+      </w:r>
+      <w:r>
+        <w:rPr>
+          <w:sz w:val="22"/>
+          <w:szCs w:val="22"/>
+          <w:u w:val="single"/>
+          <w:lang w:val="en-US"/>
+        </w:rPr>
+        <w:t>:</w:t>
+      </w:r>
+    </w:p>
+    <w:p>
+      <w:pPr>
+        <w:rPr>
+          <w:sz w:val="22"/>
+          <w:szCs w:val="22"/>
+          <w:lang w:val="en-US"/>
+        </w:rPr>
+      </w:pPr>
+      <w:r>
+        <w:rPr>
+          <w:sz w:val="22"/>
+          <w:szCs w:val="22"/>
+          <w:lang w:val="en-US"/>
+        </w:rPr>
+        <w:t xml:space="preserve">              </w:t>
+      </w:r>
+      <w:r>
+        <w:rPr>
+          <w:sz w:val="22"/>
+          <w:szCs w:val="22"/>
+          <w:lang w:val="en-US"/>
+        </w:rPr>
+        <w:t xml:space="preserve">                       </w:t>
+      </w:r>
+      <w:r>
+        <w:rPr>
+          <w:sz w:val="22"/>
+          <w:szCs w:val="22"/>
+          <w:lang w:val="en-US"/>
+        </w:rPr>
+        <w:t xml:space="preserve"> </w:t>
+      </w:r>
+      <w:r>
+        <w:rPr>
+          <w:b/>
+          <w:bCs/>
+          <w:sz w:val="22"/>
+          <w:szCs w:val="22"/>
+          <w:lang w:val="en-US"/>
+        </w:rPr>
+        <w:t>2</w:t>
+      </w:r>
+      <w:r>
+        <w:rPr>
+          <w:b/>
+          <w:bCs/>
+          <w:sz w:val="22"/>
+          <w:szCs w:val="22"/>
+          <w:lang w:val="en-US"/>
+        </w:rPr>
+        <w:t>024</w:t>
+      </w:r>
+      <w:r>
+        <w:rPr>
+          <w:sz w:val="22"/>
+          <w:szCs w:val="22"/>
+          <w:lang w:val="en-US"/>
+        </w:rPr>
+        <w:t xml:space="preserve"> </w:t>
+      </w:r>
+      <w:r>
+        <w:rPr>
+          <w:sz w:val="22"/>
+          <w:szCs w:val="22"/>
+          <w:lang w:val="en-US"/>
+        </w:rPr>
+        <w:t>–</w:t>
+      </w:r>
+      <w:r>
+        <w:rPr>
+          <w:sz w:val="22"/>
+          <w:szCs w:val="22"/>
+          <w:lang w:val="en-US"/>
+        </w:rPr>
+        <w:t xml:space="preserve"> </w:t>
+      </w:r>
+      <w:r>
+        <w:rPr>
+          <w:sz w:val="22"/>
+          <w:szCs w:val="22"/>
+          <w:lang w:val="en-US"/>
+        </w:rPr>
+        <w:t>R</w:t>
+      </w:r>
+      <w:r>
+        <w:rPr>
+          <w:sz w:val="22"/>
+          <w:szCs w:val="22"/>
+          <w:lang w:val="en-US"/>
+        </w:rPr>
+        <w:t>61 479 597</w:t>
+      </w:r>
+      <w:r>
+        <w:rPr>
+          <w:sz w:val="22"/>
+          <w:szCs w:val="22"/>
+          <w:lang w:val="en-US"/>
+        </w:rPr>
+        <w:t xml:space="preserve">                                                 </w:t>
+      </w:r>
+      <w:r>
+        <w:rPr>
+          <w:sz w:val="22"/>
+          <w:szCs w:val="22"/>
+          <w:lang w:val="en-US"/>
+        </w:rPr>
+        <w:t xml:space="preserve">    </w:t>
+      </w:r>
+      <w:r>
+        <w:rPr>
+          <w:b/>
+          <w:bCs/>
+          <w:sz w:val="22"/>
+          <w:szCs w:val="22"/>
+          <w:lang w:val="en-US"/>
+        </w:rPr>
+        <w:t>2025</w:t>
+      </w:r>
+      <w:r>
+        <w:rPr>
+          <w:sz w:val="22"/>
+          <w:szCs w:val="22"/>
+          <w:lang w:val="en-US"/>
+        </w:rPr>
+        <w:t xml:space="preserve"> - R</w:t>
+      </w:r>
+      <w:r>
+        <w:rPr>
+          <w:sz w:val="22"/>
+          <w:szCs w:val="22"/>
+          <w:lang w:val="en-US"/>
+        </w:rPr>
+        <w:t>76</w:t>
       </w:r>
       <w:r>
         <w:rPr>
@@ -4644,24 +6437,891 @@
           <w:szCs w:val="22"/>
           <w:lang w:val="en-US"/>
         </w:rPr>
-        <w:t>084</w:t>
-      </w:r>
-    </w:p>
-    <w:p>
-      <w:pPr>
-        <w:rPr>
-          <w:sz w:val="22"/>
-          <w:szCs w:val="22"/>
-          <w:lang w:val="en-US"/>
-        </w:rPr>
-      </w:pPr>
-      <w:r>
-        <w:rPr>
-          <w:sz w:val="22"/>
-          <w:szCs w:val="22"/>
-          <w:lang w:val="en-US"/>
-        </w:rPr>
-        <w:t xml:space="preserve">Administrative/Operating Expenses </w:t>
+        <w:t>728</w:t>
+      </w:r>
+      <w:r>
+        <w:rPr>
+          <w:sz w:val="22"/>
+          <w:szCs w:val="22"/>
+          <w:lang w:val="en-US"/>
+        </w:rPr>
+        <w:t> </w:t>
+      </w:r>
+      <w:r>
+        <w:rPr>
+          <w:sz w:val="22"/>
+          <w:szCs w:val="22"/>
+          <w:lang w:val="en-US"/>
+        </w:rPr>
+        <w:t>566</w:t>
+      </w:r>
+    </w:p>
+    <w:p>
+      <w:pPr>
+        <w:rPr>
+          <w:sz w:val="22"/>
+          <w:szCs w:val="22"/>
+          <w:lang w:val="en-US"/>
+        </w:rPr>
+      </w:pPr>
+    </w:p>
+    <w:p>
+      <w:pPr>
+        <w:pStyle w:val="ListParagraph"/>
+        <w:numPr>
+          <w:ilvl w:val="0"/>
+          <w:numId w:val="11"/>
+        </w:numPr>
+        <w:rPr>
+          <w:b/>
+          <w:bCs/>
+          <w:sz w:val="22"/>
+          <w:szCs w:val="22"/>
+          <w:lang w:val="en-US"/>
+        </w:rPr>
+      </w:pPr>
+      <w:r>
+        <w:rPr>
+          <w:b/>
+          <w:bCs/>
+          <w:sz w:val="22"/>
+          <w:szCs w:val="22"/>
+          <w:lang w:val="en-US"/>
+        </w:rPr>
+        <w:t>Administrative/Operating Expenses</w:t>
+      </w:r>
+    </w:p>
+    <w:p>
+      <w:pPr>
+        <w:pStyle w:val="ListParagraph"/>
+        <w:numPr>
+          <w:ilvl w:val="0"/>
+          <w:numId w:val="12"/>
+        </w:numPr>
+        <w:rPr>
+          <w:sz w:val="22"/>
+          <w:szCs w:val="22"/>
+          <w:lang w:val="en-US"/>
+        </w:rPr>
+      </w:pPr>
+      <w:r>
+        <w:rPr>
+          <w:sz w:val="22"/>
+          <w:szCs w:val="22"/>
+          <w:lang w:val="en-US"/>
+        </w:rPr>
+        <w:t>These include:</w:t>
+      </w:r>
+    </w:p>
+    <w:p>
+      <w:pPr>
+        <w:pStyle w:val="ListParagraph"/>
+        <w:ind w:left="1080"/>
+        <w:rPr>
+          <w:sz w:val="22"/>
+          <w:szCs w:val="22"/>
+          <w:lang w:val="en-US"/>
+        </w:rPr>
+      </w:pPr>
+      <w:r>
+        <w:rPr>
+          <w:sz w:val="22"/>
+          <w:szCs w:val="22"/>
+          <w:lang w:val="en-US"/>
+        </w:rPr>
+        <w:t xml:space="preserve">Accounting </w:t>
+      </w:r>
+      <w:r>
+        <w:rPr>
+          <w:sz w:val="22"/>
+          <w:szCs w:val="22"/>
+          <w:lang w:val="en-US"/>
+        </w:rPr>
+        <w:t>F</w:t>
+      </w:r>
+      <w:r>
+        <w:rPr>
+          <w:sz w:val="22"/>
+          <w:szCs w:val="22"/>
+          <w:lang w:val="en-US"/>
+        </w:rPr>
+        <w:t>ees</w:t>
+      </w:r>
+      <w:r>
+        <w:rPr>
+          <w:sz w:val="22"/>
+          <w:szCs w:val="22"/>
+          <w:lang w:val="en-US"/>
+        </w:rPr>
+        <w:t>/</w:t>
+      </w:r>
+      <w:r>
+        <w:rPr>
+          <w:sz w:val="22"/>
+          <w:szCs w:val="22"/>
+          <w:lang w:val="en-US"/>
+        </w:rPr>
+        <w:t>G</w:t>
+      </w:r>
+      <w:r>
+        <w:rPr>
+          <w:sz w:val="22"/>
+          <w:szCs w:val="22"/>
+          <w:lang w:val="en-US"/>
+        </w:rPr>
+        <w:t>overnance</w:t>
+      </w:r>
+    </w:p>
+    <w:p>
+      <w:pPr>
+        <w:pStyle w:val="ListParagraph"/>
+        <w:ind w:left="1080"/>
+        <w:rPr>
+          <w:sz w:val="22"/>
+          <w:szCs w:val="22"/>
+          <w:lang w:val="en-US"/>
+        </w:rPr>
+      </w:pPr>
+      <w:r>
+        <w:rPr>
+          <w:sz w:val="22"/>
+          <w:szCs w:val="22"/>
+          <w:lang w:val="en-US"/>
+        </w:rPr>
+        <w:t>Advertising</w:t>
+      </w:r>
+      <w:r>
+        <w:rPr>
+          <w:sz w:val="22"/>
+          <w:szCs w:val="22"/>
+          <w:lang w:val="en-US"/>
+        </w:rPr>
+        <w:t>/</w:t>
+      </w:r>
+      <w:r>
+        <w:rPr>
+          <w:sz w:val="22"/>
+          <w:szCs w:val="22"/>
+          <w:lang w:val="en-US"/>
+        </w:rPr>
+        <w:t>M</w:t>
+      </w:r>
+      <w:r>
+        <w:rPr>
+          <w:sz w:val="22"/>
+          <w:szCs w:val="22"/>
+          <w:lang w:val="en-US"/>
+        </w:rPr>
+        <w:t>arketing</w:t>
+      </w:r>
+    </w:p>
+    <w:p>
+      <w:pPr>
+        <w:pStyle w:val="ListParagraph"/>
+        <w:ind w:left="1080"/>
+        <w:rPr>
+          <w:sz w:val="22"/>
+          <w:szCs w:val="22"/>
+          <w:lang w:val="en-US"/>
+        </w:rPr>
+      </w:pPr>
+      <w:r>
+        <w:rPr>
+          <w:sz w:val="22"/>
+          <w:szCs w:val="22"/>
+          <w:lang w:val="en-US"/>
+        </w:rPr>
+        <w:t>B</w:t>
+      </w:r>
+      <w:r>
+        <w:rPr>
+          <w:sz w:val="22"/>
+          <w:szCs w:val="22"/>
+          <w:lang w:val="en-US"/>
+        </w:rPr>
+        <w:t xml:space="preserve">ank </w:t>
+      </w:r>
+      <w:r>
+        <w:rPr>
+          <w:sz w:val="22"/>
+          <w:szCs w:val="22"/>
+          <w:lang w:val="en-US"/>
+        </w:rPr>
+        <w:t>C</w:t>
+      </w:r>
+      <w:r>
+        <w:rPr>
+          <w:sz w:val="22"/>
+          <w:szCs w:val="22"/>
+          <w:lang w:val="en-US"/>
+        </w:rPr>
+        <w:t>harges</w:t>
+      </w:r>
+    </w:p>
+    <w:p>
+      <w:pPr>
+        <w:pStyle w:val="ListParagraph"/>
+        <w:ind w:left="1080"/>
+        <w:rPr>
+          <w:sz w:val="22"/>
+          <w:szCs w:val="22"/>
+          <w:lang w:val="en-US"/>
+        </w:rPr>
+      </w:pPr>
+      <w:r>
+        <w:rPr>
+          <w:sz w:val="22"/>
+          <w:szCs w:val="22"/>
+          <w:lang w:val="en-US"/>
+        </w:rPr>
+        <w:t>C</w:t>
+      </w:r>
+      <w:r>
+        <w:rPr>
+          <w:sz w:val="22"/>
+          <w:szCs w:val="22"/>
+          <w:lang w:val="en-US"/>
+        </w:rPr>
+        <w:t xml:space="preserve">omputer </w:t>
+      </w:r>
+      <w:r>
+        <w:rPr>
+          <w:sz w:val="22"/>
+          <w:szCs w:val="22"/>
+          <w:lang w:val="en-US"/>
+        </w:rPr>
+        <w:t>E</w:t>
+      </w:r>
+      <w:r>
+        <w:rPr>
+          <w:sz w:val="22"/>
+          <w:szCs w:val="22"/>
+          <w:lang w:val="en-US"/>
+        </w:rPr>
+        <w:t>xpenses</w:t>
+      </w:r>
+      <w:r>
+        <w:rPr>
+          <w:sz w:val="22"/>
+          <w:szCs w:val="22"/>
+          <w:lang w:val="en-US"/>
+        </w:rPr>
+        <w:t>/</w:t>
+      </w:r>
+      <w:r>
+        <w:rPr>
+          <w:sz w:val="22"/>
+          <w:szCs w:val="22"/>
+          <w:lang w:val="en-US"/>
+        </w:rPr>
+        <w:t>W</w:t>
+      </w:r>
+      <w:r>
+        <w:rPr>
+          <w:sz w:val="22"/>
+          <w:szCs w:val="22"/>
+          <w:lang w:val="en-US"/>
+        </w:rPr>
+        <w:t>ebsite</w:t>
+      </w:r>
+    </w:p>
+    <w:p>
+      <w:pPr>
+        <w:pStyle w:val="ListParagraph"/>
+        <w:ind w:left="1080"/>
+        <w:rPr>
+          <w:sz w:val="22"/>
+          <w:szCs w:val="22"/>
+          <w:lang w:val="en-US"/>
+        </w:rPr>
+      </w:pPr>
+      <w:r>
+        <w:rPr>
+          <w:sz w:val="22"/>
+          <w:szCs w:val="22"/>
+          <w:lang w:val="en-US"/>
+        </w:rPr>
+        <w:t>D</w:t>
+      </w:r>
+      <w:r>
+        <w:rPr>
+          <w:sz w:val="22"/>
+          <w:szCs w:val="22"/>
+          <w:lang w:val="en-US"/>
+        </w:rPr>
+        <w:t>epreciations</w:t>
+      </w:r>
+    </w:p>
+    <w:p>
+      <w:pPr>
+        <w:pStyle w:val="ListParagraph"/>
+        <w:ind w:left="1080"/>
+        <w:rPr>
+          <w:sz w:val="22"/>
+          <w:szCs w:val="22"/>
+          <w:lang w:val="en-US"/>
+        </w:rPr>
+      </w:pPr>
+      <w:r>
+        <w:rPr>
+          <w:sz w:val="22"/>
+          <w:szCs w:val="22"/>
+          <w:lang w:val="en-US"/>
+        </w:rPr>
+        <w:lastRenderedPageBreak/>
+        <w:t>E</w:t>
+      </w:r>
+      <w:r>
+        <w:rPr>
+          <w:sz w:val="22"/>
+          <w:szCs w:val="22"/>
+          <w:lang w:val="en-US"/>
+        </w:rPr>
+        <w:t xml:space="preserve">mployee </w:t>
+      </w:r>
+      <w:r>
+        <w:rPr>
+          <w:sz w:val="22"/>
+          <w:szCs w:val="22"/>
+          <w:lang w:val="en-US"/>
+        </w:rPr>
+        <w:t>C</w:t>
+      </w:r>
+      <w:r>
+        <w:rPr>
+          <w:sz w:val="22"/>
+          <w:szCs w:val="22"/>
+          <w:lang w:val="en-US"/>
+        </w:rPr>
+        <w:t xml:space="preserve">osts </w:t>
+      </w:r>
+    </w:p>
+    <w:p>
+      <w:pPr>
+        <w:pStyle w:val="ListParagraph"/>
+        <w:ind w:left="1080"/>
+        <w:rPr>
+          <w:sz w:val="22"/>
+          <w:szCs w:val="22"/>
+          <w:lang w:val="en-US"/>
+        </w:rPr>
+      </w:pPr>
+      <w:r>
+        <w:rPr>
+          <w:sz w:val="22"/>
+          <w:szCs w:val="22"/>
+          <w:lang w:val="en-US"/>
+        </w:rPr>
+        <w:t>E</w:t>
+      </w:r>
+      <w:r>
+        <w:rPr>
+          <w:sz w:val="22"/>
+          <w:szCs w:val="22"/>
+          <w:lang w:val="en-US"/>
+        </w:rPr>
+        <w:t>ntertainment</w:t>
+      </w:r>
+    </w:p>
+    <w:p>
+      <w:pPr>
+        <w:pStyle w:val="ListParagraph"/>
+        <w:ind w:left="1080"/>
+        <w:rPr>
+          <w:sz w:val="22"/>
+          <w:szCs w:val="22"/>
+          <w:lang w:val="en-US"/>
+        </w:rPr>
+      </w:pPr>
+      <w:r>
+        <w:rPr>
+          <w:sz w:val="22"/>
+          <w:szCs w:val="22"/>
+          <w:lang w:val="en-US"/>
+        </w:rPr>
+        <w:t>F</w:t>
+      </w:r>
+      <w:r>
+        <w:rPr>
+          <w:sz w:val="22"/>
+          <w:szCs w:val="22"/>
+          <w:lang w:val="en-US"/>
+        </w:rPr>
+        <w:t xml:space="preserve">inance </w:t>
+      </w:r>
+      <w:r>
+        <w:rPr>
+          <w:sz w:val="22"/>
+          <w:szCs w:val="22"/>
+          <w:lang w:val="en-US"/>
+        </w:rPr>
+        <w:t>C</w:t>
+      </w:r>
+      <w:r>
+        <w:rPr>
+          <w:sz w:val="22"/>
+          <w:szCs w:val="22"/>
+          <w:lang w:val="en-US"/>
+        </w:rPr>
+        <w:t>osts</w:t>
+      </w:r>
+    </w:p>
+    <w:p>
+      <w:pPr>
+        <w:pStyle w:val="ListParagraph"/>
+        <w:ind w:left="1080"/>
+        <w:rPr>
+          <w:sz w:val="22"/>
+          <w:szCs w:val="22"/>
+          <w:lang w:val="en-US"/>
+        </w:rPr>
+      </w:pPr>
+      <w:r>
+        <w:rPr>
+          <w:sz w:val="22"/>
+          <w:szCs w:val="22"/>
+          <w:lang w:val="en-US"/>
+        </w:rPr>
+        <w:t>L</w:t>
+      </w:r>
+      <w:r>
+        <w:rPr>
+          <w:sz w:val="22"/>
+          <w:szCs w:val="22"/>
+          <w:lang w:val="en-US"/>
+        </w:rPr>
+        <w:t xml:space="preserve">iability and </w:t>
+      </w:r>
+      <w:r>
+        <w:rPr>
+          <w:sz w:val="22"/>
+          <w:szCs w:val="22"/>
+          <w:lang w:val="en-US"/>
+        </w:rPr>
+        <w:t>A</w:t>
+      </w:r>
+      <w:r>
+        <w:rPr>
+          <w:sz w:val="22"/>
+          <w:szCs w:val="22"/>
+          <w:lang w:val="en-US"/>
+        </w:rPr>
+        <w:t xml:space="preserve">ssets </w:t>
+      </w:r>
+      <w:r>
+        <w:rPr>
+          <w:sz w:val="22"/>
+          <w:szCs w:val="22"/>
+          <w:lang w:val="en-US"/>
+        </w:rPr>
+        <w:t>I</w:t>
+      </w:r>
+      <w:r>
+        <w:rPr>
+          <w:sz w:val="22"/>
+          <w:szCs w:val="22"/>
+          <w:lang w:val="en-US"/>
+        </w:rPr>
+        <w:t>nsurance</w:t>
+      </w:r>
+    </w:p>
+    <w:p>
+      <w:pPr>
+        <w:pStyle w:val="ListParagraph"/>
+        <w:ind w:left="1080"/>
+        <w:rPr>
+          <w:sz w:val="22"/>
+          <w:szCs w:val="22"/>
+          <w:lang w:val="en-US"/>
+        </w:rPr>
+      </w:pPr>
+      <w:r>
+        <w:rPr>
+          <w:sz w:val="22"/>
+          <w:szCs w:val="22"/>
+          <w:lang w:val="en-US"/>
+        </w:rPr>
+        <w:t>Courier</w:t>
+      </w:r>
+      <w:r>
+        <w:rPr>
+          <w:sz w:val="22"/>
+          <w:szCs w:val="22"/>
+          <w:lang w:val="en-US"/>
+        </w:rPr>
+        <w:t xml:space="preserve"> and </w:t>
+      </w:r>
+      <w:r>
+        <w:rPr>
+          <w:sz w:val="22"/>
+          <w:szCs w:val="22"/>
+          <w:lang w:val="en-US"/>
+        </w:rPr>
+        <w:t>P</w:t>
+      </w:r>
+      <w:r>
+        <w:rPr>
+          <w:sz w:val="22"/>
+          <w:szCs w:val="22"/>
+          <w:lang w:val="en-US"/>
+        </w:rPr>
+        <w:t xml:space="preserve">ostage </w:t>
+      </w:r>
+      <w:r>
+        <w:rPr>
+          <w:sz w:val="22"/>
+          <w:szCs w:val="22"/>
+          <w:lang w:val="en-US"/>
+        </w:rPr>
+        <w:t>F</w:t>
+      </w:r>
+      <w:r>
+        <w:rPr>
+          <w:sz w:val="22"/>
+          <w:szCs w:val="22"/>
+          <w:lang w:val="en-US"/>
+        </w:rPr>
+        <w:t>ees</w:t>
+      </w:r>
+    </w:p>
+    <w:p>
+      <w:pPr>
+        <w:pStyle w:val="ListParagraph"/>
+        <w:ind w:left="1080"/>
+        <w:rPr>
+          <w:sz w:val="22"/>
+          <w:szCs w:val="22"/>
+          <w:lang w:val="en-US"/>
+        </w:rPr>
+      </w:pPr>
+      <w:r>
+        <w:rPr>
+          <w:sz w:val="22"/>
+          <w:szCs w:val="22"/>
+          <w:lang w:val="en-US"/>
+        </w:rPr>
+        <w:t>P</w:t>
+      </w:r>
+      <w:r>
+        <w:rPr>
+          <w:sz w:val="22"/>
+          <w:szCs w:val="22"/>
+          <w:lang w:val="en-US"/>
+        </w:rPr>
+        <w:t xml:space="preserve">rinting </w:t>
+      </w:r>
+      <w:r>
+        <w:rPr>
+          <w:sz w:val="22"/>
+          <w:szCs w:val="22"/>
+          <w:lang w:val="en-US"/>
+        </w:rPr>
+        <w:t>a</w:t>
+      </w:r>
+      <w:r>
+        <w:rPr>
+          <w:sz w:val="22"/>
+          <w:szCs w:val="22"/>
+          <w:lang w:val="en-US"/>
+        </w:rPr>
+        <w:t xml:space="preserve">nd </w:t>
+      </w:r>
+      <w:r>
+        <w:rPr>
+          <w:sz w:val="22"/>
+          <w:szCs w:val="22"/>
+          <w:lang w:val="en-US"/>
+        </w:rPr>
+        <w:t>S</w:t>
+      </w:r>
+      <w:r>
+        <w:rPr>
+          <w:sz w:val="22"/>
+          <w:szCs w:val="22"/>
+          <w:lang w:val="en-US"/>
+        </w:rPr>
+        <w:t>tationery</w:t>
+      </w:r>
+    </w:p>
+    <w:p>
+      <w:pPr>
+        <w:pStyle w:val="ListParagraph"/>
+        <w:ind w:left="1080"/>
+        <w:rPr>
+          <w:sz w:val="22"/>
+          <w:szCs w:val="22"/>
+          <w:lang w:val="en-US"/>
+        </w:rPr>
+      </w:pPr>
+      <w:r>
+        <w:rPr>
+          <w:sz w:val="22"/>
+          <w:szCs w:val="22"/>
+          <w:lang w:val="en-US"/>
+        </w:rPr>
+        <w:t>U</w:t>
+      </w:r>
+      <w:r>
+        <w:rPr>
+          <w:sz w:val="22"/>
+          <w:szCs w:val="22"/>
+          <w:lang w:val="en-US"/>
+        </w:rPr>
+        <w:t xml:space="preserve">tilities </w:t>
+      </w:r>
+      <w:r>
+        <w:rPr>
+          <w:sz w:val="22"/>
+          <w:szCs w:val="22"/>
+          <w:lang w:val="en-US"/>
+        </w:rPr>
+        <w:t>(Phone, Fax, Internet)</w:t>
+      </w:r>
+    </w:p>
+    <w:p>
+      <w:pPr>
+        <w:pStyle w:val="ListParagraph"/>
+        <w:ind w:left="1080"/>
+        <w:rPr>
+          <w:sz w:val="22"/>
+          <w:szCs w:val="22"/>
+          <w:lang w:val="en-US"/>
+        </w:rPr>
+      </w:pPr>
+      <w:r>
+        <w:rPr>
+          <w:sz w:val="22"/>
+          <w:szCs w:val="22"/>
+          <w:lang w:val="en-US"/>
+        </w:rPr>
+        <w:t>Rent</w:t>
+      </w:r>
+    </w:p>
+    <w:p>
+      <w:pPr>
+        <w:pStyle w:val="ListParagraph"/>
+        <w:ind w:left="1080"/>
+        <w:rPr>
+          <w:sz w:val="22"/>
+          <w:szCs w:val="22"/>
+          <w:lang w:val="en-US"/>
+        </w:rPr>
+      </w:pPr>
+      <w:r>
+        <w:rPr>
+          <w:sz w:val="22"/>
+          <w:szCs w:val="22"/>
+          <w:lang w:val="en-US"/>
+        </w:rPr>
+        <w:t>Travel (Fundraising/General)</w:t>
+      </w:r>
+    </w:p>
+    <w:p>
+      <w:pPr>
+        <w:pStyle w:val="ListParagraph"/>
+        <w:numPr>
+          <w:ilvl w:val="0"/>
+          <w:numId w:val="12"/>
+        </w:numPr>
+        <w:rPr>
+          <w:sz w:val="22"/>
+          <w:szCs w:val="22"/>
+          <w:u w:val="single"/>
+          <w:lang w:val="en-US"/>
+        </w:rPr>
+      </w:pPr>
+      <w:r>
+        <w:rPr>
+          <w:sz w:val="22"/>
+          <w:szCs w:val="22"/>
+          <w:u w:val="single"/>
+          <w:lang w:val="en-US"/>
+        </w:rPr>
+        <w:t>TOTAL ADMIN/OPERATIONG EXPENSES</w:t>
+      </w:r>
+      <w:r>
+        <w:rPr>
+          <w:sz w:val="22"/>
+          <w:szCs w:val="22"/>
+          <w:u w:val="single"/>
+          <w:lang w:val="en-US"/>
+        </w:rPr>
+        <w:t>:</w:t>
+      </w:r>
+    </w:p>
+    <w:p>
+      <w:pPr>
+        <w:pStyle w:val="ListParagraph"/>
+        <w:ind w:left="1080"/>
+        <w:rPr>
+          <w:sz w:val="22"/>
+          <w:szCs w:val="22"/>
+          <w:lang w:val="en-US"/>
+        </w:rPr>
+      </w:pPr>
+      <w:r>
+        <w:rPr>
+          <w:sz w:val="22"/>
+          <w:szCs w:val="22"/>
+          <w:lang w:val="en-US"/>
+        </w:rPr>
+        <w:t xml:space="preserve">                    </w:t>
+      </w:r>
+      <w:r>
+        <w:rPr>
+          <w:b/>
+          <w:bCs/>
+          <w:sz w:val="22"/>
+          <w:szCs w:val="22"/>
+          <w:lang w:val="en-US"/>
+        </w:rPr>
+        <w:t>20</w:t>
+      </w:r>
+      <w:r>
+        <w:rPr>
+          <w:b/>
+          <w:bCs/>
+          <w:sz w:val="22"/>
+          <w:szCs w:val="22"/>
+          <w:lang w:val="en-US"/>
+        </w:rPr>
+        <w:t>24</w:t>
+      </w:r>
+      <w:r>
+        <w:rPr>
+          <w:sz w:val="22"/>
+          <w:szCs w:val="22"/>
+          <w:lang w:val="en-US"/>
+        </w:rPr>
+        <w:t xml:space="preserve"> – R</w:t>
+      </w:r>
+      <w:r>
+        <w:rPr>
+          <w:sz w:val="22"/>
+          <w:szCs w:val="22"/>
+          <w:lang w:val="en-US"/>
+        </w:rPr>
+        <w:t>2 769 359</w:t>
+      </w:r>
+      <w:r>
+        <w:rPr>
+          <w:sz w:val="22"/>
+          <w:szCs w:val="22"/>
+          <w:lang w:val="en-US"/>
+        </w:rPr>
+        <w:t xml:space="preserve">                                                        </w:t>
+      </w:r>
+      <w:r>
+        <w:rPr>
+          <w:b/>
+          <w:bCs/>
+          <w:sz w:val="22"/>
+          <w:szCs w:val="22"/>
+          <w:lang w:val="en-US"/>
+        </w:rPr>
+        <w:t>2025</w:t>
+      </w:r>
+      <w:r>
+        <w:rPr>
+          <w:sz w:val="22"/>
+          <w:szCs w:val="22"/>
+          <w:lang w:val="en-US"/>
+        </w:rPr>
+        <w:t xml:space="preserve"> – R3</w:t>
+      </w:r>
+      <w:r>
+        <w:rPr>
+          <w:sz w:val="22"/>
+          <w:szCs w:val="22"/>
+          <w:lang w:val="en-US"/>
+        </w:rPr>
+        <w:t> 421</w:t>
+      </w:r>
+      <w:r>
+        <w:rPr>
+          <w:sz w:val="22"/>
+          <w:szCs w:val="22"/>
+          <w:lang w:val="en-US"/>
+        </w:rPr>
+        <w:t> </w:t>
+      </w:r>
+      <w:r>
+        <w:rPr>
+          <w:sz w:val="22"/>
+          <w:szCs w:val="22"/>
+          <w:lang w:val="en-US"/>
+        </w:rPr>
+        <w:t>089</w:t>
+      </w:r>
+    </w:p>
+    <w:p>
+      <w:pPr>
+        <w:rPr>
+          <w:sz w:val="22"/>
+          <w:szCs w:val="22"/>
+          <w:lang w:val="en-US"/>
+        </w:rPr>
+      </w:pPr>
+    </w:p>
+    <w:p>
+      <w:pPr>
+        <w:pStyle w:val="ListParagraph"/>
+        <w:numPr>
+          <w:ilvl w:val="0"/>
+          <w:numId w:val="11"/>
+        </w:numPr>
+        <w:rPr>
+          <w:sz w:val="22"/>
+          <w:szCs w:val="22"/>
+          <w:u w:val="single"/>
+          <w:lang w:val="en-US"/>
+        </w:rPr>
+      </w:pPr>
+      <w:r>
+        <w:rPr>
+          <w:sz w:val="22"/>
+          <w:szCs w:val="22"/>
+          <w:u w:val="single"/>
+          <w:lang w:val="en-US"/>
+        </w:rPr>
+        <w:t>TOTAL ALL EXPENSES:</w:t>
+      </w:r>
+    </w:p>
+    <w:p>
+      <w:pPr>
+        <w:rPr>
+          <w:sz w:val="22"/>
+          <w:szCs w:val="22"/>
+          <w:lang w:val="en-US"/>
+        </w:rPr>
+      </w:pPr>
+      <w:r>
+        <w:rPr>
+          <w:b/>
+          <w:bCs/>
+          <w:sz w:val="22"/>
+          <w:szCs w:val="22"/>
+          <w:lang w:val="en-US"/>
+        </w:rPr>
+        <w:t xml:space="preserve">   20</w:t>
+      </w:r>
+      <w:r>
+        <w:rPr>
+          <w:b/>
+          <w:bCs/>
+          <w:sz w:val="22"/>
+          <w:szCs w:val="22"/>
+          <w:lang w:val="en-US"/>
+        </w:rPr>
+        <w:t>24</w:t>
+      </w:r>
+      <w:r>
+        <w:rPr>
+          <w:sz w:val="22"/>
+          <w:szCs w:val="22"/>
+          <w:lang w:val="en-US"/>
+        </w:rPr>
+        <w:t xml:space="preserve"> </w:t>
       </w:r>
       <w:r>
         <w:rPr>
@@ -4685,52 +7345,367 @@
           <w:szCs w:val="22"/>
           <w:lang w:val="en-US"/>
         </w:rPr>
-        <w:t>R16 481939</w:t>
-      </w:r>
-    </w:p>
-    <w:p>
-      <w:pPr>
-        <w:rPr>
-          <w:sz w:val="22"/>
-          <w:szCs w:val="22"/>
-          <w:lang w:val="en-US"/>
-        </w:rPr>
-      </w:pPr>
-      <w:r>
-        <w:rPr>
-          <w:sz w:val="22"/>
-          <w:szCs w:val="22"/>
-          <w:lang w:val="en-US"/>
-        </w:rPr>
-        <w:t xml:space="preserve">Net Revenue </w:t>
-      </w:r>
-      <w:r>
-        <w:rPr>
-          <w:sz w:val="22"/>
-          <w:szCs w:val="22"/>
-          <w:lang w:val="en-US"/>
-        </w:rPr>
-        <w:t>–</w:t>
-      </w:r>
-      <w:r>
-        <w:rPr>
-          <w:sz w:val="22"/>
-          <w:szCs w:val="22"/>
-          <w:lang w:val="en-US"/>
-        </w:rPr>
-        <w:t xml:space="preserve"> </w:t>
-      </w:r>
-      <w:r>
-        <w:rPr>
-          <w:sz w:val="22"/>
-          <w:szCs w:val="22"/>
-        </w:rPr>
-        <w:t>R4 156 145</w:t>
-      </w:r>
-    </w:p>
-    <w:p>
-      <w:pPr>
-        <w:rPr>
+        <w:t>R</w:t>
+      </w:r>
+      <w:r>
+        <w:rPr>
+          <w:sz w:val="22"/>
+          <w:szCs w:val="22"/>
+          <w:lang w:val="en-US"/>
+        </w:rPr>
+        <w:t>64</w:t>
+      </w:r>
+      <w:r>
+        <w:rPr>
+          <w:sz w:val="22"/>
+          <w:szCs w:val="22"/>
+          <w:lang w:val="en-US"/>
+        </w:rPr>
+        <w:t> 248 956</w:t>
+      </w:r>
+      <w:r>
+        <w:rPr>
+          <w:sz w:val="22"/>
+          <w:szCs w:val="22"/>
+          <w:lang w:val="en-US"/>
+        </w:rPr>
+        <w:t xml:space="preserve">                                                                                          </w:t>
+      </w:r>
+      <w:r>
+        <w:rPr>
+          <w:b/>
+          <w:bCs/>
+          <w:sz w:val="22"/>
+          <w:szCs w:val="22"/>
+          <w:lang w:val="en-US"/>
+        </w:rPr>
+        <w:t>2025</w:t>
+      </w:r>
+      <w:r>
+        <w:rPr>
+          <w:sz w:val="22"/>
+          <w:szCs w:val="22"/>
+          <w:lang w:val="en-US"/>
+        </w:rPr>
+        <w:t xml:space="preserve"> – R80 149</w:t>
+      </w:r>
+      <w:r>
+        <w:rPr>
+          <w:sz w:val="22"/>
+          <w:szCs w:val="22"/>
+          <w:lang w:val="en-US"/>
+        </w:rPr>
+        <w:t> </w:t>
+      </w:r>
+      <w:r>
+        <w:rPr>
+          <w:sz w:val="22"/>
+          <w:szCs w:val="22"/>
+          <w:lang w:val="en-US"/>
+        </w:rPr>
+        <w:t>089</w:t>
+      </w:r>
+    </w:p>
+    <w:p>
+      <w:pPr>
+        <w:rPr>
+          <w:sz w:val="22"/>
+          <w:szCs w:val="22"/>
+          <w:lang w:val="en-US"/>
+        </w:rPr>
+      </w:pPr>
+    </w:p>
+    <w:p>
+      <w:pPr>
+        <w:rPr>
+          <w:b/>
+          <w:bCs/>
+          <w:sz w:val="22"/>
+          <w:szCs w:val="22"/>
+          <w:lang w:val="en-US"/>
+        </w:rPr>
+      </w:pPr>
+      <w:r>
+        <w:rPr>
+          <w:b/>
+          <w:bCs/>
+          <w:sz w:val="22"/>
+          <w:szCs w:val="22"/>
+          <w:lang w:val="en-US"/>
+        </w:rPr>
+        <w:t xml:space="preserve">In total the </w:t>
+      </w:r>
+      <w:r>
+        <w:rPr>
+          <w:b/>
+          <w:bCs/>
+          <w:sz w:val="22"/>
+          <w:szCs w:val="22"/>
+          <w:lang w:val="en-US"/>
+        </w:rPr>
+        <w:t xml:space="preserve">Annual Financial Budget </w:t>
+      </w:r>
+      <w:r>
+        <w:rPr>
+          <w:b/>
+          <w:bCs/>
+          <w:sz w:val="22"/>
+          <w:szCs w:val="22"/>
+          <w:lang w:val="en-US"/>
+        </w:rPr>
+        <w:t>estimation</w:t>
+      </w:r>
+      <w:r>
+        <w:rPr>
+          <w:b/>
+          <w:bCs/>
+          <w:sz w:val="22"/>
+          <w:szCs w:val="22"/>
+          <w:lang w:val="en-US"/>
+        </w:rPr>
+        <w:t xml:space="preserve"> based on </w:t>
+      </w:r>
+      <w:r>
+        <w:rPr>
+          <w:b/>
+          <w:bCs/>
+          <w:sz w:val="22"/>
+          <w:szCs w:val="22"/>
+          <w:lang w:val="en-US"/>
+        </w:rPr>
+        <w:t xml:space="preserve">comparisons of </w:t>
+      </w:r>
+      <w:r>
+        <w:rPr>
+          <w:b/>
+          <w:bCs/>
+          <w:sz w:val="22"/>
+          <w:szCs w:val="22"/>
+          <w:lang w:val="en-US"/>
+        </w:rPr>
+        <w:t xml:space="preserve">Annual Financial Reports </w:t>
+      </w:r>
+      <w:r>
+        <w:rPr>
+          <w:b/>
+          <w:bCs/>
+          <w:sz w:val="22"/>
+          <w:szCs w:val="22"/>
+          <w:lang w:val="en-US"/>
+        </w:rPr>
+        <w:t>for</w:t>
+      </w:r>
+      <w:r>
+        <w:rPr>
+          <w:b/>
+          <w:bCs/>
+          <w:sz w:val="22"/>
+          <w:szCs w:val="22"/>
+          <w:lang w:val="en-US"/>
+        </w:rPr>
+        <w:t xml:space="preserve"> 2 different years</w:t>
+      </w:r>
+      <w:r>
+        <w:rPr>
+          <w:b/>
+          <w:bCs/>
+          <w:sz w:val="22"/>
+          <w:szCs w:val="22"/>
+          <w:lang w:val="en-US"/>
+        </w:rPr>
+        <w:t xml:space="preserve"> should be: R270 000</w:t>
+      </w:r>
+      <w:r>
+        <w:rPr>
+          <w:b/>
+          <w:bCs/>
+          <w:sz w:val="22"/>
+          <w:szCs w:val="22"/>
+          <w:lang w:val="en-US"/>
+        </w:rPr>
+        <w:t> </w:t>
+      </w:r>
+      <w:r>
+        <w:rPr>
+          <w:b/>
+          <w:bCs/>
+          <w:sz w:val="22"/>
+          <w:szCs w:val="22"/>
+          <w:lang w:val="en-US"/>
+        </w:rPr>
+        <w:t>000</w:t>
+      </w:r>
+    </w:p>
+    <w:p>
+      <w:pPr>
+        <w:rPr>
+          <w:b/>
+          <w:bCs/>
+          <w:sz w:val="22"/>
+          <w:szCs w:val="22"/>
+          <w:lang w:val="en-US"/>
+        </w:rPr>
+      </w:pPr>
+    </w:p>
+    <w:p>
+      <w:pPr>
+        <w:rPr>
+          <w:b/>
+          <w:bCs/>
+          <w:sz w:val="22"/>
+          <w:szCs w:val="22"/>
+          <w:lang w:val="en-US"/>
+        </w:rPr>
+      </w:pPr>
+    </w:p>
+    <w:p>
+      <w:pPr>
+        <w:rPr>
+          <w:b/>
+          <w:bCs/>
+          <w:sz w:val="22"/>
+          <w:szCs w:val="22"/>
+          <w:lang w:val="en-US"/>
+        </w:rPr>
+      </w:pPr>
+    </w:p>
+    <w:p>
+      <w:pPr>
+        <w:rPr>
+          <w:b/>
+          <w:bCs/>
+          <w:sz w:val="22"/>
+          <w:szCs w:val="22"/>
+          <w:lang w:val="en-US"/>
+        </w:rPr>
+      </w:pPr>
+    </w:p>
+    <w:p>
+      <w:pPr>
+        <w:rPr>
+          <w:b/>
+          <w:bCs/>
+          <w:sz w:val="22"/>
+          <w:szCs w:val="22"/>
+          <w:lang w:val="en-US"/>
+        </w:rPr>
+      </w:pPr>
+    </w:p>
+    <w:p>
+      <w:pPr>
+        <w:rPr>
+          <w:b/>
+          <w:bCs/>
+          <w:sz w:val="22"/>
+          <w:szCs w:val="22"/>
+          <w:lang w:val="en-US"/>
+        </w:rPr>
+      </w:pPr>
+    </w:p>
+    <w:p>
+      <w:pPr>
+        <w:rPr>
+          <w:b/>
+          <w:bCs/>
+          <w:sz w:val="22"/>
+          <w:szCs w:val="22"/>
+          <w:lang w:val="en-US"/>
+        </w:rPr>
+      </w:pPr>
+    </w:p>
+    <w:p>
+      <w:pPr>
+        <w:rPr>
+          <w:b/>
+          <w:bCs/>
+          <w:sz w:val="22"/>
+          <w:szCs w:val="22"/>
+          <w:lang w:val="en-US"/>
+        </w:rPr>
+      </w:pPr>
+    </w:p>
+    <w:p>
+      <w:pPr>
+        <w:rPr>
+          <w:b/>
+          <w:bCs/>
+          <w:sz w:val="22"/>
+          <w:szCs w:val="22"/>
+          <w:lang w:val="en-US"/>
+        </w:rPr>
+      </w:pPr>
+    </w:p>
+    <w:p>
+      <w:pPr>
+        <w:rPr>
+          <w:b/>
+          <w:bCs/>
+          <w:sz w:val="22"/>
+          <w:szCs w:val="22"/>
+          <w:lang w:val="en-US"/>
+        </w:rPr>
+      </w:pPr>
+    </w:p>
+    <w:p>
+      <w:pPr>
+        <w:rPr>
+          <w:b/>
+          <w:bCs/>
+          <w:sz w:val="22"/>
+          <w:szCs w:val="22"/>
+          <w:lang w:val="en-US"/>
+        </w:rPr>
+      </w:pPr>
+    </w:p>
+    <w:p>
+      <w:pPr>
+        <w:rPr>
+          <w:b/>
+          <w:bCs/>
+          <w:sz w:val="22"/>
+          <w:szCs w:val="22"/>
+          <w:lang w:val="en-US"/>
+        </w:rPr>
+      </w:pPr>
+    </w:p>
+    <w:p>
+      <w:pPr>
+        <w:rPr>
+          <w:b/>
+          <w:bCs/>
+          <w:sz w:val="22"/>
+          <w:szCs w:val="22"/>
+          <w:lang w:val="en-US"/>
+        </w:rPr>
+      </w:pPr>
+    </w:p>
+    <w:p>
+      <w:pPr>
+        <w:rPr>
+          <w:b/>
+          <w:bCs/>
+          <w:sz w:val="22"/>
+          <w:szCs w:val="22"/>
+          <w:lang w:val="en-US"/>
+        </w:rPr>
+      </w:pPr>
+    </w:p>
+    <w:p>
+      <w:pPr>
+        <w:rPr>
+          <w:b/>
+          <w:bCs/>
+          <w:sz w:val="22"/>
+          <w:szCs w:val="22"/>
+          <w:lang w:val="en-US"/>
+        </w:rPr>
+      </w:pPr>
+    </w:p>
+    <w:p>
+      <w:pPr>
+        <w:rPr>
+          <w:b/>
+          <w:bCs/>
           <w:sz w:val="22"/>
           <w:szCs w:val="22"/>
           <w:lang w:val="en-US"/>
@@ -4746,7 +7721,7 @@
           <w:lang w:val="en-US"/>
         </w:rPr>
       </w:pPr>
-      <w:bookmarkStart w:id="8" w:name="_Toc237638672"/>
+      <w:bookmarkStart w:id="8" w:name="_Toc237702217"/>
       <w:r>
         <w:rPr>
           <w:sz w:val="22"/>
@@ -4765,6 +7740,54 @@
         <w:t>es</w:t>
       </w:r>
       <w:bookmarkEnd w:id="8"/>
+    </w:p>
+    <w:p>
+      <w:pPr>
+        <w:rPr>
+          <w:lang w:val="en-US"/>
+        </w:rPr>
+      </w:pPr>
+    </w:p>
+    <w:p>
+      <w:pPr>
+        <w:rPr>
+          <w:b/>
+          <w:bCs/>
+          <w:sz w:val="22"/>
+          <w:szCs w:val="22"/>
+          <w:lang w:val="en-US"/>
+        </w:rPr>
+      </w:pPr>
+      <w:r>
+        <w:rPr>
+          <w:b/>
+          <w:bCs/>
+          <w:sz w:val="22"/>
+          <w:szCs w:val="22"/>
+          <w:lang w:val="en-US"/>
+        </w:rPr>
+        <w:t>Organization overview</w:t>
+      </w:r>
+      <w:r>
+        <w:rPr>
+          <w:b/>
+          <w:bCs/>
+          <w:sz w:val="22"/>
+          <w:szCs w:val="22"/>
+          <w:lang w:val="en-US"/>
+        </w:rPr>
+        <w:t xml:space="preserve"> </w:t>
+      </w:r>
+      <w:r>
+        <w:rPr>
+          <w:b/>
+          <w:bCs/>
+          <w:sz w:val="22"/>
+          <w:szCs w:val="22"/>
+          <w:lang w:val="en-US"/>
+        </w:rPr>
+        <w:t>&amp; Website goals and objectives</w:t>
+      </w:r>
     </w:p>
     <w:p>
       <w:pPr>
@@ -4774,14 +7797,95 @@
           <w:numId w:val="10"/>
         </w:numPr>
         <w:rPr>
-          <w:lang w:val="en-US"/>
-        </w:rPr>
-      </w:pPr>
-      <w:r>
-        <w:rPr>
-          <w:lang w:val="en-US"/>
-        </w:rPr>
-        <w:t>https://www.thelunchboxfund.org/</w:t>
+          <w:sz w:val="22"/>
+          <w:szCs w:val="22"/>
+          <w:lang w:val="en-US"/>
+        </w:rPr>
+      </w:pPr>
+      <w:r>
+        <w:rPr>
+          <w:sz w:val="22"/>
+          <w:szCs w:val="22"/>
+          <w:lang w:val="en-US"/>
+        </w:rPr>
+        <w:t>The Lunchbox Fund</w:t>
+      </w:r>
+      <w:r>
+        <w:rPr>
+          <w:sz w:val="22"/>
+          <w:szCs w:val="22"/>
+          <w:lang w:val="en-US"/>
+        </w:rPr>
+        <w:t xml:space="preserve"> [</w:t>
+      </w:r>
+      <w:proofErr w:type="gramStart"/>
+      <w:r>
+        <w:rPr>
+          <w:sz w:val="22"/>
+          <w:szCs w:val="22"/>
+          <w:lang w:val="en-US"/>
+        </w:rPr>
+        <w:t>online]  Available</w:t>
+      </w:r>
+      <w:proofErr w:type="gramEnd"/>
+      <w:r>
+        <w:rPr>
+          <w:sz w:val="22"/>
+          <w:szCs w:val="22"/>
+          <w:lang w:val="en-US"/>
+        </w:rPr>
+        <w:t xml:space="preserve"> at: </w:t>
+      </w:r>
+      <w:r>
+        <w:rPr>
+          <w:sz w:val="22"/>
+          <w:szCs w:val="22"/>
+          <w:lang w:val="en-US"/>
+        </w:rPr>
+        <w:t xml:space="preserve">&lt; </w:t>
+      </w:r>
+      <w:hyperlink r:id="rId8" w:history="1">
+        <w:r>
+          <w:rPr>
+            <w:rStyle w:val="Hyperlink"/>
+            <w:sz w:val="22"/>
+            <w:szCs w:val="22"/>
+            <w:lang w:val="en-US"/>
+          </w:rPr>
+          <w:t>https://www.thelunchboxfund.org/</w:t>
+        </w:r>
+      </w:hyperlink>
+      <w:r>
+        <w:rPr>
+          <w:sz w:val="22"/>
+          <w:szCs w:val="22"/>
+          <w:lang w:val="en-US"/>
+        </w:rPr>
+        <w:t xml:space="preserve"> &gt;</w:t>
+      </w:r>
+      <w:r>
+        <w:rPr>
+          <w:sz w:val="22"/>
+          <w:szCs w:val="22"/>
+          <w:lang w:val="en-US"/>
+        </w:rPr>
+        <w:t xml:space="preserve"> [Accessed </w:t>
+      </w:r>
+      <w:r>
+        <w:rPr>
+          <w:sz w:val="22"/>
+          <w:szCs w:val="22"/>
+          <w:lang w:val="en-US"/>
+        </w:rPr>
+        <w:t>08 August 2026</w:t>
+      </w:r>
+      <w:r>
+        <w:rPr>
+          <w:sz w:val="22"/>
+          <w:szCs w:val="22"/>
+          <w:lang w:val="en-US"/>
+        </w:rPr>
+        <w:t>]</w:t>
       </w:r>
     </w:p>
     <w:p>
@@ -4792,20 +7896,502 @@
           <w:numId w:val="10"/>
         </w:numPr>
         <w:rPr>
-          <w:lang w:val="en-US"/>
-        </w:rPr>
-      </w:pPr>
-      <w:r>
-        <w:rPr>
-          <w:lang w:val="en-US"/>
-        </w:rPr>
-        <w:t xml:space="preserve">2019 Annual Report, </w:t>
-      </w:r>
-      <w:r>
-        <w:rPr>
-          <w:lang w:val="en-US"/>
-        </w:rPr>
-        <w:t>https://uploads-ssl.webflow.com/5dc9b504aa4ac344e9872359/602eb3cbf7b7a10799f565e6_Lunchbox%20Fund%20Annual%20Report%202019.pdf</w:t>
+          <w:sz w:val="22"/>
+          <w:szCs w:val="22"/>
+          <w:lang w:val="en-US"/>
+        </w:rPr>
+      </w:pPr>
+      <w:r>
+        <w:rPr>
+          <w:sz w:val="22"/>
+          <w:szCs w:val="22"/>
+          <w:lang w:val="en-US"/>
+        </w:rPr>
+        <w:t>Wikipedia, The Lunchbox Fund</w:t>
+      </w:r>
+      <w:r>
+        <w:rPr>
+          <w:sz w:val="22"/>
+          <w:szCs w:val="22"/>
+          <w:lang w:val="en-US"/>
+        </w:rPr>
+        <w:t xml:space="preserve"> [online]. Avail</w:t>
+      </w:r>
+      <w:r>
+        <w:rPr>
+          <w:sz w:val="22"/>
+          <w:szCs w:val="22"/>
+          <w:lang w:val="en-US"/>
+        </w:rPr>
+        <w:t xml:space="preserve">able at: &lt; </w:t>
+      </w:r>
+      <w:hyperlink r:id="rId9" w:history="1">
+        <w:r>
+          <w:rPr>
+            <w:rStyle w:val="Hyperlink"/>
+            <w:sz w:val="22"/>
+            <w:szCs w:val="22"/>
+            <w:lang w:val="en-US"/>
+          </w:rPr>
+          <w:t>https://en.wikipedia.org/wiki/The_Lunchbox_Fund</w:t>
+        </w:r>
+      </w:hyperlink>
+      <w:r>
+        <w:rPr>
+          <w:sz w:val="22"/>
+          <w:szCs w:val="22"/>
+          <w:lang w:val="en-US"/>
+        </w:rPr>
+        <w:t xml:space="preserve"> &gt; </w:t>
+      </w:r>
+      <w:proofErr w:type="gramStart"/>
+      <w:r>
+        <w:rPr>
+          <w:sz w:val="22"/>
+          <w:szCs w:val="22"/>
+          <w:lang w:val="en-US"/>
+        </w:rPr>
+        <w:t>[ Access</w:t>
+      </w:r>
+      <w:r>
+        <w:rPr>
+          <w:sz w:val="22"/>
+          <w:szCs w:val="22"/>
+          <w:lang w:val="en-US"/>
+        </w:rPr>
+        <w:t>ed</w:t>
+      </w:r>
+      <w:proofErr w:type="gramEnd"/>
+      <w:r>
+        <w:rPr>
+          <w:sz w:val="22"/>
+          <w:szCs w:val="22"/>
+          <w:lang w:val="en-US"/>
+        </w:rPr>
+        <w:t xml:space="preserve"> 08 August 2026]</w:t>
+      </w:r>
+    </w:p>
+    <w:p>
+      <w:pPr>
+        <w:pStyle w:val="ListParagraph"/>
+        <w:numPr>
+          <w:ilvl w:val="0"/>
+          <w:numId w:val="10"/>
+        </w:numPr>
+        <w:rPr>
+          <w:sz w:val="22"/>
+          <w:szCs w:val="22"/>
+          <w:lang w:val="en-US"/>
+        </w:rPr>
+      </w:pPr>
+      <w:r>
+        <w:rPr>
+          <w:sz w:val="22"/>
+          <w:szCs w:val="22"/>
+          <w:lang w:val="en-US"/>
+        </w:rPr>
+        <w:t xml:space="preserve"> </w:t>
+      </w:r>
+      <w:r>
+        <w:rPr>
+          <w:sz w:val="22"/>
+          <w:szCs w:val="22"/>
+          <w:lang w:val="en-US"/>
+        </w:rPr>
+        <w:t>Lunchbox Fund, 2019. 2019 Annual Re</w:t>
+      </w:r>
+      <w:r>
+        <w:rPr>
+          <w:sz w:val="22"/>
+          <w:szCs w:val="22"/>
+          <w:lang w:val="en-US"/>
+        </w:rPr>
+        <w:t xml:space="preserve">port </w:t>
+      </w:r>
+      <w:r>
+        <w:rPr>
+          <w:sz w:val="22"/>
+          <w:szCs w:val="22"/>
+          <w:lang w:val="en-US"/>
+        </w:rPr>
+        <w:t xml:space="preserve">– </w:t>
+      </w:r>
+      <w:proofErr w:type="spellStart"/>
+      <w:r>
+        <w:rPr>
+          <w:sz w:val="22"/>
+          <w:szCs w:val="22"/>
+          <w:lang w:val="en-US"/>
+        </w:rPr>
+        <w:t>Webflow</w:t>
+      </w:r>
+      <w:proofErr w:type="spellEnd"/>
+      <w:r>
+        <w:rPr>
+          <w:sz w:val="22"/>
+          <w:szCs w:val="22"/>
+          <w:lang w:val="en-US"/>
+        </w:rPr>
+        <w:t xml:space="preserve"> </w:t>
+      </w:r>
+      <w:r>
+        <w:rPr>
+          <w:sz w:val="22"/>
+          <w:szCs w:val="22"/>
+          <w:lang w:val="en-US"/>
+        </w:rPr>
+        <w:t xml:space="preserve">[online] </w:t>
+      </w:r>
+      <w:r>
+        <w:rPr>
+          <w:sz w:val="22"/>
+          <w:szCs w:val="22"/>
+          <w:lang w:val="en-US"/>
+        </w:rPr>
+        <w:t xml:space="preserve">Available at: &lt; </w:t>
+      </w:r>
+      <w:hyperlink r:id="rId10" w:history="1">
+        <w:r>
+          <w:rPr>
+            <w:rStyle w:val="Hyperlink"/>
+            <w:sz w:val="22"/>
+            <w:szCs w:val="22"/>
+            <w:lang w:val="en-US"/>
+          </w:rPr>
+          <w:t>https://uploads-ssl.webflow.com/5dc9b504aa4ac344e9872359/602eb3cbf7b7a10799f565e6_Lunchbox%20Fund%20Annual%20Report%202019.pdf</w:t>
+        </w:r>
+      </w:hyperlink>
+      <w:r>
+        <w:rPr>
+          <w:sz w:val="22"/>
+          <w:szCs w:val="22"/>
+          <w:lang w:val="en-US"/>
+        </w:rPr>
+        <w:t xml:space="preserve"> &gt;</w:t>
+      </w:r>
+    </w:p>
+    <w:p>
+      <w:pPr>
+        <w:pStyle w:val="ListParagraph"/>
+        <w:numPr>
+          <w:ilvl w:val="0"/>
+          <w:numId w:val="10"/>
+        </w:numPr>
+        <w:rPr>
+          <w:sz w:val="22"/>
+          <w:szCs w:val="22"/>
+          <w:lang w:val="en-US"/>
+        </w:rPr>
+      </w:pPr>
+      <w:r>
+        <w:rPr>
+          <w:sz w:val="22"/>
+          <w:szCs w:val="22"/>
+        </w:rPr>
+        <w:t xml:space="preserve">The </w:t>
+      </w:r>
+      <w:proofErr w:type="spellStart"/>
+      <w:r>
+        <w:rPr>
+          <w:sz w:val="22"/>
+          <w:szCs w:val="22"/>
+        </w:rPr>
+        <w:t>BorgenProject</w:t>
+      </w:r>
+      <w:proofErr w:type="spellEnd"/>
+      <w:r>
+        <w:rPr>
+          <w:sz w:val="22"/>
+          <w:szCs w:val="22"/>
+        </w:rPr>
+        <w:t xml:space="preserve">, </w:t>
+      </w:r>
+      <w:r>
+        <w:rPr>
+          <w:sz w:val="22"/>
+          <w:szCs w:val="22"/>
+        </w:rPr>
+        <w:t xml:space="preserve">2018. </w:t>
+      </w:r>
+      <w:proofErr w:type="spellStart"/>
+      <w:r>
+        <w:rPr>
+          <w:sz w:val="22"/>
+          <w:szCs w:val="22"/>
+        </w:rPr>
+        <w:t>Feedie</w:t>
+      </w:r>
+      <w:proofErr w:type="spellEnd"/>
+      <w:r>
+        <w:rPr>
+          <w:sz w:val="22"/>
+          <w:szCs w:val="22"/>
+        </w:rPr>
+        <w:t xml:space="preserve"> and the Lunchbox Fund Fight Childhood Hunger in South Africa</w:t>
+      </w:r>
+      <w:r>
+        <w:rPr>
+          <w:sz w:val="22"/>
+          <w:szCs w:val="22"/>
+        </w:rPr>
+        <w:t xml:space="preserve"> [online] </w:t>
+      </w:r>
+      <w:r>
+        <w:rPr>
+          <w:sz w:val="22"/>
+          <w:szCs w:val="22"/>
+        </w:rPr>
+        <w:t xml:space="preserve">Available at: &lt; </w:t>
+      </w:r>
+      <w:hyperlink r:id="rId11" w:history="1">
+        <w:r>
+          <w:rPr>
+            <w:rStyle w:val="Hyperlink"/>
+            <w:sz w:val="22"/>
+            <w:szCs w:val="22"/>
+          </w:rPr>
+          <w:t>https://borgenproject.org/childhood-hunger-in-south-africa/</w:t>
+        </w:r>
+      </w:hyperlink>
+      <w:r>
+        <w:rPr>
+          <w:sz w:val="22"/>
+          <w:szCs w:val="22"/>
+        </w:rPr>
+        <w:t xml:space="preserve"> &gt;</w:t>
+      </w:r>
+    </w:p>
+    <w:p>
+      <w:pPr>
+        <w:pStyle w:val="ListParagraph"/>
+        <w:numPr>
+          <w:ilvl w:val="0"/>
+          <w:numId w:val="10"/>
+        </w:numPr>
+        <w:rPr>
+          <w:sz w:val="22"/>
+          <w:szCs w:val="22"/>
+          <w:lang w:val="en-US"/>
+        </w:rPr>
+      </w:pPr>
+      <w:r>
+        <w:rPr>
+          <w:sz w:val="22"/>
+          <w:szCs w:val="22"/>
+          <w:lang w:val="en-US"/>
+        </w:rPr>
+        <w:t xml:space="preserve">Lunchbox Fund, 2019. </w:t>
+      </w:r>
+      <w:r>
+        <w:rPr>
+          <w:sz w:val="22"/>
+          <w:szCs w:val="22"/>
+          <w:lang w:val="en-US"/>
+        </w:rPr>
+        <w:t>2019 Annual Repor</w:t>
+      </w:r>
+      <w:r>
+        <w:rPr>
+          <w:sz w:val="22"/>
+          <w:szCs w:val="22"/>
+          <w:lang w:val="en-US"/>
+        </w:rPr>
+        <w:t>t [online] Available at:</w:t>
+      </w:r>
+      <w:r>
+        <w:rPr>
+          <w:sz w:val="22"/>
+          <w:szCs w:val="22"/>
+          <w:lang w:val="en-US"/>
+        </w:rPr>
+        <w:t xml:space="preserve"> </w:t>
+      </w:r>
+      <w:r>
+        <w:rPr>
+          <w:sz w:val="22"/>
+          <w:szCs w:val="22"/>
+          <w:lang w:val="en-US"/>
+        </w:rPr>
+        <w:t xml:space="preserve">&lt; </w:t>
+      </w:r>
+      <w:hyperlink r:id="rId12" w:history="1">
+        <w:r>
+          <w:rPr>
+            <w:rStyle w:val="Hyperlink"/>
+            <w:sz w:val="22"/>
+            <w:szCs w:val="22"/>
+            <w:lang w:val="en-US"/>
+          </w:rPr>
+          <w:t>https://uploads-ssl.webflow.com/5dc9b504aa4ac344e9872359/602eb3cbf7b7a10799f565e6_Lunchbox%20Fund%20Annual%20Report%202019.pdf</w:t>
+        </w:r>
+      </w:hyperlink>
+      <w:r>
+        <w:rPr>
+          <w:sz w:val="22"/>
+          <w:szCs w:val="22"/>
+          <w:lang w:val="en-US"/>
+        </w:rPr>
+        <w:t xml:space="preserve"> &gt;</w:t>
+      </w:r>
+    </w:p>
+    <w:p>
+      <w:pPr>
+        <w:rPr>
+          <w:sz w:val="22"/>
+          <w:szCs w:val="22"/>
+          <w:lang w:val="en-US"/>
+        </w:rPr>
+      </w:pPr>
+    </w:p>
+    <w:p>
+      <w:pPr>
+        <w:rPr>
+          <w:b/>
+          <w:bCs/>
+          <w:sz w:val="22"/>
+          <w:szCs w:val="22"/>
+          <w:lang w:val="en-US"/>
+        </w:rPr>
+      </w:pPr>
+      <w:r>
+        <w:rPr>
+          <w:b/>
+          <w:bCs/>
+          <w:sz w:val="22"/>
+          <w:szCs w:val="22"/>
+          <w:lang w:val="en-US"/>
+        </w:rPr>
+        <w:t>Budget</w:t>
+      </w:r>
+    </w:p>
+    <w:p>
+      <w:pPr>
+        <w:pStyle w:val="ListParagraph"/>
+        <w:numPr>
+          <w:ilvl w:val="0"/>
+          <w:numId w:val="10"/>
+        </w:numPr>
+        <w:rPr>
+          <w:sz w:val="22"/>
+          <w:szCs w:val="22"/>
+          <w:lang w:val="en-US"/>
+        </w:rPr>
+      </w:pPr>
+      <w:r>
+        <w:rPr>
+          <w:sz w:val="22"/>
+          <w:szCs w:val="22"/>
+          <w:lang w:val="en-US"/>
+        </w:rPr>
+        <w:t>Lunchbox Fund</w:t>
+      </w:r>
+      <w:r>
+        <w:rPr>
+          <w:sz w:val="22"/>
+          <w:szCs w:val="22"/>
+          <w:lang w:val="en-US"/>
+        </w:rPr>
+        <w:t xml:space="preserve">, 2024. </w:t>
+      </w:r>
+      <w:r>
+        <w:rPr>
+          <w:sz w:val="22"/>
+          <w:szCs w:val="22"/>
+          <w:lang w:val="en-US"/>
+        </w:rPr>
+        <w:t>2024 A</w:t>
+      </w:r>
+      <w:r>
+        <w:rPr>
+          <w:sz w:val="22"/>
+          <w:szCs w:val="22"/>
+          <w:lang w:val="en-US"/>
+        </w:rPr>
+        <w:t xml:space="preserve">nnual Report [online] </w:t>
+      </w:r>
+      <w:r>
+        <w:rPr>
+          <w:sz w:val="22"/>
+          <w:szCs w:val="22"/>
+          <w:lang w:val="en-US"/>
+        </w:rPr>
+        <w:t xml:space="preserve">Available at: </w:t>
+      </w:r>
+      <w:r>
+        <w:rPr>
+          <w:sz w:val="22"/>
+          <w:szCs w:val="22"/>
+          <w:lang w:val="en-US"/>
+        </w:rPr>
+        <w:t xml:space="preserve">&lt; </w:t>
+      </w:r>
+      <w:hyperlink r:id="rId13" w:history="1">
+        <w:r>
+          <w:rPr>
+            <w:rStyle w:val="Hyperlink"/>
+            <w:sz w:val="22"/>
+            <w:szCs w:val="22"/>
+            <w:lang w:val="en-US"/>
+          </w:rPr>
+          <w:t>https://cdn.prod.website-files.com/5dcafdbe4d247f4aa384ee99/68ded0b86e8042ab45408dcb_Lunchbox%20Fund%202024%20Annual%20Report.pdf</w:t>
+        </w:r>
+      </w:hyperlink>
+      <w:r>
+        <w:rPr>
+          <w:sz w:val="22"/>
+          <w:szCs w:val="22"/>
+          <w:lang w:val="en-US"/>
+        </w:rPr>
+        <w:t xml:space="preserve"> &gt;</w:t>
+      </w:r>
+    </w:p>
+    <w:p>
+      <w:pPr>
+        <w:pStyle w:val="ListParagraph"/>
+        <w:numPr>
+          <w:ilvl w:val="0"/>
+          <w:numId w:val="10"/>
+        </w:numPr>
+        <w:rPr>
+          <w:sz w:val="22"/>
+          <w:szCs w:val="22"/>
+          <w:lang w:val="en-US"/>
+        </w:rPr>
+      </w:pPr>
+      <w:r>
+        <w:rPr>
+          <w:sz w:val="22"/>
+          <w:szCs w:val="22"/>
+          <w:lang w:val="en-US"/>
+        </w:rPr>
+        <w:t>Lunchbox Fund, 2025. 2025 Annual Report [</w:t>
+      </w:r>
+      <w:r>
+        <w:rPr>
+          <w:sz w:val="22"/>
+          <w:szCs w:val="22"/>
+          <w:lang w:val="en-US"/>
+        </w:rPr>
+        <w:t xml:space="preserve">online] Available at: &lt; </w:t>
+      </w:r>
+      <w:hyperlink r:id="rId14" w:history="1">
+        <w:r>
+          <w:rPr>
+            <w:rStyle w:val="Hyperlink"/>
+            <w:sz w:val="22"/>
+            <w:szCs w:val="22"/>
+            <w:lang w:val="en-US"/>
+          </w:rPr>
+          <w:t>https://cdn.prod.website-files.com/5dcafdbe4d247f4aa384ee99/6a0fc1d223631697a33abe27_Lunchbox%20Fund%20Annual%20Report%202025.pdf</w:t>
+        </w:r>
+      </w:hyperlink>
+      <w:r>
+        <w:rPr>
+          <w:sz w:val="22"/>
+          <w:szCs w:val="22"/>
+          <w:lang w:val="en-US"/>
+        </w:rPr>
+        <w:t xml:space="preserve"> &gt;</w:t>
       </w:r>
     </w:p>
     <w:p>
@@ -4877,7 +8463,7 @@
       </w:pPr>
     </w:p>
     <w:sectPr>
-      <w:footerReference w:type="default" r:id="rId8"/>
+      <w:footerReference w:type="default" r:id="rId15"/>
       <w:pgSz w:w="11906" w:h="16838"/>
       <w:pgMar w:top="1440" w:right="1440" w:bottom="1440" w:left="1440" w:header="708" w:footer="708" w:gutter="0"/>
       <w:cols w:space="708"/>
@@ -5913,9 +9499,121 @@
     </w:lvl>
   </w:abstractNum>
   <w:abstractNum w:abstractNumId="8" w15:restartNumberingAfterBreak="0">
-    <w:nsid w:val="77885B7A"/>
+    <w:nsid w:val="57E40AA2"/>
     <w:multiLevelType w:val="hybridMultilevel"/>
-    <w:tmpl w:val="372C0AC2"/>
+    <w:tmpl w:val="DD0246D2"/>
+    <w:lvl w:ilvl="0" w:tplc="D9205AA0">
+      <w:numFmt w:val="bullet"/>
+      <w:lvlText w:val="-"/>
+      <w:lvlJc w:val="left"/>
+      <w:pPr>
+        <w:ind w:left="1080" w:hanging="360"/>
+      </w:pPr>
+      <w:rPr>
+        <w:rFonts w:ascii="Aptos" w:eastAsiaTheme="minorHAnsi" w:hAnsi="Aptos" w:cstheme="minorBidi" w:hint="default"/>
+      </w:rPr>
+    </w:lvl>
+    <w:lvl w:ilvl="1" w:tplc="1C090003" w:tentative="1">
+      <w:start w:val="1"/>
+      <w:numFmt w:val="bullet"/>
+      <w:lvlText w:val="o"/>
+      <w:lvlJc w:val="left"/>
+      <w:pPr>
+        <w:ind w:left="1800" w:hanging="360"/>
+      </w:pPr>
+      <w:rPr>
+        <w:rFonts w:ascii="Courier New" w:hAnsi="Courier New" w:cs="Courier New" w:hint="default"/>
+      </w:rPr>
+    </w:lvl>
+    <w:lvl w:ilvl="2" w:tplc="1C090005" w:tentative="1">
+      <w:start w:val="1"/>
+      <w:numFmt w:val="bullet"/>
+      <w:lvlText w:val=""/>
+      <w:lvlJc w:val="left"/>
+      <w:pPr>
+        <w:ind w:left="2520" w:hanging="360"/>
+      </w:pPr>
+      <w:rPr>
+        <w:rFonts w:ascii="Wingdings" w:hAnsi="Wingdings" w:hint="default"/>
+      </w:rPr>
+    </w:lvl>
+    <w:lvl w:ilvl="3" w:tplc="1C090001" w:tentative="1">
+      <w:start w:val="1"/>
+      <w:numFmt w:val="bullet"/>
+      <w:lvlText w:val=""/>
+      <w:lvlJc w:val="left"/>
+      <w:pPr>
+        <w:ind w:left="3240" w:hanging="360"/>
+      </w:pPr>
+      <w:rPr>
+        <w:rFonts w:ascii="Symbol" w:hAnsi="Symbol" w:hint="default"/>
+      </w:rPr>
+    </w:lvl>
+    <w:lvl w:ilvl="4" w:tplc="1C090003" w:tentative="1">
+      <w:start w:val="1"/>
+      <w:numFmt w:val="bullet"/>
+      <w:lvlText w:val="o"/>
+      <w:lvlJc w:val="left"/>
+      <w:pPr>
+        <w:ind w:left="3960" w:hanging="360"/>
+      </w:pPr>
+      <w:rPr>
+        <w:rFonts w:ascii="Courier New" w:hAnsi="Courier New" w:cs="Courier New" w:hint="default"/>
+      </w:rPr>
+    </w:lvl>
+    <w:lvl w:ilvl="5" w:tplc="1C090005" w:tentative="1">
+      <w:start w:val="1"/>
+      <w:numFmt w:val="bullet"/>
+      <w:lvlText w:val=""/>
+      <w:lvlJc w:val="left"/>
+      <w:pPr>
+        <w:ind w:left="4680" w:hanging="360"/>
+      </w:pPr>
+      <w:rPr>
+        <w:rFonts w:ascii="Wingdings" w:hAnsi="Wingdings" w:hint="default"/>
+      </w:rPr>
+    </w:lvl>
+    <w:lvl w:ilvl="6" w:tplc="1C090001" w:tentative="1">
+      <w:start w:val="1"/>
+      <w:numFmt w:val="bullet"/>
+      <w:lvlText w:val=""/>
+      <w:lvlJc w:val="left"/>
+      <w:pPr>
+        <w:ind w:left="5400" w:hanging="360"/>
+      </w:pPr>
+      <w:rPr>
+        <w:rFonts w:ascii="Symbol" w:hAnsi="Symbol" w:hint="default"/>
+      </w:rPr>
+    </w:lvl>
+    <w:lvl w:ilvl="7" w:tplc="1C090003" w:tentative="1">
+      <w:start w:val="1"/>
+      <w:numFmt w:val="bullet"/>
+      <w:lvlText w:val="o"/>
+      <w:lvlJc w:val="left"/>
+      <w:pPr>
+        <w:ind w:left="6120" w:hanging="360"/>
+      </w:pPr>
+      <w:rPr>
+        <w:rFonts w:ascii="Courier New" w:hAnsi="Courier New" w:cs="Courier New" w:hint="default"/>
+      </w:rPr>
+    </w:lvl>
+    <w:lvl w:ilvl="8" w:tplc="1C090005" w:tentative="1">
+      <w:start w:val="1"/>
+      <w:numFmt w:val="bullet"/>
+      <w:lvlText w:val=""/>
+      <w:lvlJc w:val="left"/>
+      <w:pPr>
+        <w:ind w:left="6840" w:hanging="360"/>
+      </w:pPr>
+      <w:rPr>
+        <w:rFonts w:ascii="Wingdings" w:hAnsi="Wingdings" w:hint="default"/>
+      </w:rPr>
+    </w:lvl>
+  </w:abstractNum>
+  <w:abstractNum w:abstractNumId="9" w15:restartNumberingAfterBreak="0">
+    <w:nsid w:val="6C012989"/>
+    <w:multiLevelType w:val="hybridMultilevel"/>
+    <w:tmpl w:val="DF00B8CC"/>
     <w:lvl w:ilvl="0" w:tplc="1C090001">
       <w:start w:val="1"/>
       <w:numFmt w:val="bullet"/>
@@ -6025,7 +9723,120 @@
       </w:rPr>
     </w:lvl>
   </w:abstractNum>
-  <w:abstractNum w:abstractNumId="9" w15:restartNumberingAfterBreak="0">
+  <w:abstractNum w:abstractNumId="10" w15:restartNumberingAfterBreak="0">
+    <w:nsid w:val="77885B7A"/>
+    <w:multiLevelType w:val="hybridMultilevel"/>
+    <w:tmpl w:val="372C0AC2"/>
+    <w:lvl w:ilvl="0" w:tplc="1C090001">
+      <w:start w:val="1"/>
+      <w:numFmt w:val="bullet"/>
+      <w:lvlText w:val=""/>
+      <w:lvlJc w:val="left"/>
+      <w:pPr>
+        <w:ind w:left="720" w:hanging="360"/>
+      </w:pPr>
+      <w:rPr>
+        <w:rFonts w:ascii="Symbol" w:hAnsi="Symbol" w:hint="default"/>
+      </w:rPr>
+    </w:lvl>
+    <w:lvl w:ilvl="1" w:tplc="1C090003" w:tentative="1">
+      <w:start w:val="1"/>
+      <w:numFmt w:val="bullet"/>
+      <w:lvlText w:val="o"/>
+      <w:lvlJc w:val="left"/>
+      <w:pPr>
+        <w:ind w:left="1440" w:hanging="360"/>
+      </w:pPr>
+      <w:rPr>
+        <w:rFonts w:ascii="Courier New" w:hAnsi="Courier New" w:cs="Courier New" w:hint="default"/>
+      </w:rPr>
+    </w:lvl>
+    <w:lvl w:ilvl="2" w:tplc="1C090005" w:tentative="1">
+      <w:start w:val="1"/>
+      <w:numFmt w:val="bullet"/>
+      <w:lvlText w:val=""/>
+      <w:lvlJc w:val="left"/>
+      <w:pPr>
+        <w:ind w:left="2160" w:hanging="360"/>
+      </w:pPr>
+      <w:rPr>
+        <w:rFonts w:ascii="Wingdings" w:hAnsi="Wingdings" w:hint="default"/>
+      </w:rPr>
+    </w:lvl>
+    <w:lvl w:ilvl="3" w:tplc="1C090001" w:tentative="1">
+      <w:start w:val="1"/>
+      <w:numFmt w:val="bullet"/>
+      <w:lvlText w:val=""/>
+      <w:lvlJc w:val="left"/>
+      <w:pPr>
+        <w:ind w:left="2880" w:hanging="360"/>
+      </w:pPr>
+      <w:rPr>
+        <w:rFonts w:ascii="Symbol" w:hAnsi="Symbol" w:hint="default"/>
+      </w:rPr>
+    </w:lvl>
+    <w:lvl w:ilvl="4" w:tplc="1C090003" w:tentative="1">
+      <w:start w:val="1"/>
+      <w:numFmt w:val="bullet"/>
+      <w:lvlText w:val="o"/>
+      <w:lvlJc w:val="left"/>
+      <w:pPr>
+        <w:ind w:left="3600" w:hanging="360"/>
+      </w:pPr>
+      <w:rPr>
+        <w:rFonts w:ascii="Courier New" w:hAnsi="Courier New" w:cs="Courier New" w:hint="default"/>
+      </w:rPr>
+    </w:lvl>
+    <w:lvl w:ilvl="5" w:tplc="1C090005" w:tentative="1">
+      <w:start w:val="1"/>
+      <w:numFmt w:val="bullet"/>
+      <w:lvlText w:val=""/>
+      <w:lvlJc w:val="left"/>
+      <w:pPr>
+        <w:ind w:left="4320" w:hanging="360"/>
+      </w:pPr>
+      <w:rPr>
+        <w:rFonts w:ascii="Wingdings" w:hAnsi="Wingdings" w:hint="default"/>
+      </w:rPr>
+    </w:lvl>
+    <w:lvl w:ilvl="6" w:tplc="1C090001" w:tentative="1">
+      <w:start w:val="1"/>
+      <w:numFmt w:val="bullet"/>
+      <w:lvlText w:val=""/>
+      <w:lvlJc w:val="left"/>
+      <w:pPr>
+        <w:ind w:left="5040" w:hanging="360"/>
+      </w:pPr>
+      <w:rPr>
+        <w:rFonts w:ascii="Symbol" w:hAnsi="Symbol" w:hint="default"/>
+      </w:rPr>
+    </w:lvl>
+    <w:lvl w:ilvl="7" w:tplc="1C090003" w:tentative="1">
+      <w:start w:val="1"/>
+      <w:numFmt w:val="bullet"/>
+      <w:lvlText w:val="o"/>
+      <w:lvlJc w:val="left"/>
+      <w:pPr>
+        <w:ind w:left="5760" w:hanging="360"/>
+      </w:pPr>
+      <w:rPr>
+        <w:rFonts w:ascii="Courier New" w:hAnsi="Courier New" w:cs="Courier New" w:hint="default"/>
+      </w:rPr>
+    </w:lvl>
+    <w:lvl w:ilvl="8" w:tplc="1C090005" w:tentative="1">
+      <w:start w:val="1"/>
+      <w:numFmt w:val="bullet"/>
+      <w:lvlText w:val=""/>
+      <w:lvlJc w:val="left"/>
+      <w:pPr>
+        <w:ind w:left="6480" w:hanging="360"/>
+      </w:pPr>
+      <w:rPr>
+        <w:rFonts w:ascii="Wingdings" w:hAnsi="Wingdings" w:hint="default"/>
+      </w:rPr>
+    </w:lvl>
+  </w:abstractNum>
+  <w:abstractNum w:abstractNumId="11" w15:restartNumberingAfterBreak="0">
     <w:nsid w:val="7A7E055F"/>
     <w:multiLevelType w:val="hybridMultilevel"/>
     <w:tmpl w:val="3300F5FA"/>
@@ -6151,7 +9962,7 @@
     <w:abstractNumId w:val="3"/>
   </w:num>
   <w:num w:numId="5" w16cid:durableId="2053579917">
-    <w:abstractNumId w:val="9"/>
+    <w:abstractNumId w:val="11"/>
   </w:num>
   <w:num w:numId="6" w16cid:durableId="1349678047">
     <w:abstractNumId w:val="2"/>
@@ -6163,10 +9974,16 @@
     <w:abstractNumId w:val="1"/>
   </w:num>
   <w:num w:numId="9" w16cid:durableId="1741323738">
-    <w:abstractNumId w:val="8"/>
+    <w:abstractNumId w:val="10"/>
   </w:num>
   <w:num w:numId="10" w16cid:durableId="795491102">
     <w:abstractNumId w:val="7"/>
+  </w:num>
+  <w:num w:numId="11" w16cid:durableId="856425220">
+    <w:abstractNumId w:val="9"/>
+  </w:num>
+  <w:num w:numId="12" w16cid:durableId="998732646">
+    <w:abstractNumId w:val="8"/>
   </w:num>
 </w:numbering>
 </file>
@@ -6571,7 +10388,7 @@
   <w:style w:type="paragraph" w:default="1" w:styleId="Normal">
     <w:name w:val="Normal"/>
     <w:qFormat/>
-    <w:rsid w:val="004C308B"/>
+    <w:rsid w:val="00554B2D"/>
   </w:style>
   <w:style w:type="paragraph" w:styleId="Heading1">
     <w:name w:val="heading 1"/>

</xml_diff>